<commit_message>
update PLC Technology syllabus to 20-20-60 assessment (20/20/60); add change diff + replacement draft
</commit_message>
<xml_diff>
--- a/course/PLC技术与应用/2025/大纲/25JD32411-PLC技术与应用-课程教学大纲.docx
+++ b/course/PLC技术与应用/2025/大纲/25JD32411-PLC技术与应用-课程教学大纲.docx
@@ -5548,17 +5548,15 @@
     </w:p>
     <w:p>
       <w:pPr>
-        <w:spacing w:line="283" w:lineRule="auto" w:before="0" w:after="20"/>
+        <w:spacing w:line="283" w:lineRule="auto" w:before="0" w:after="0"/>
         <w:ind w:firstLine="420"/>
         <w:jc w:val="left"/>
       </w:pPr>
       <w:r>
         <w:rPr>
-          <w:rFonts w:ascii="Times New Roman" w:hAnsi="Times New Roman" w:eastAsia="宋体"/>
-          <w:b w:val="0"/>
-          <w:sz w:val="21"/>
+          <w:rFonts w:ascii="Times New Roman" w:hAnsi="Times New Roman" w:cs="Times New Roman" w:eastAsia="宋体"/>
         </w:rPr>
-        <w:t>本课程采用考查。总评由平时学习与过程记录15%、上机任务35%、综合设计成果40%、个人核验与答辩10%构成。下表各考核列的百分比是该项考核内部的教学内容分配，不是总评比例；每列分别合计100%。</w:t>
+        <w:t>本课程采用考查。总评由平时成绩20%、课程作业20%、期末综合考查60%构成。期末综合考查采用综合设计成果和个人核验答辩，不安排期末笔试或机考。原综合设计成果与个人核验答辩不再单独占总评比例，而是统一归并到期末综合考查中。下表各考核列百分比为该项考核内部的教学内容分配，各列分别合计100%。</w:t>
       </w:r>
     </w:p>
     <w:tbl>
@@ -5584,7 +5582,6 @@
         <w:gridCol w:w="959"/>
         <w:gridCol w:w="959"/>
         <w:gridCol w:w="959"/>
-        <w:gridCol w:w="959"/>
         <w:gridCol w:w="1435"/>
       </w:tblGrid>
       <w:tr>
@@ -5605,15 +5602,14 @@
           </w:tcPr>
           <w:p>
             <w:pPr>
-              <w:spacing w:line="269" w:lineRule="auto" w:before="0" w:after="0"/>
+              <w:spacing w:line="240" w:lineRule="auto" w:before="0" w:after="0"/>
               <w:jc w:val="center"/>
             </w:pPr>
-            <w:r/>
-            <w:r>
-              <w:rPr>
-                <w:rFonts w:ascii="Times New Roman" w:hAnsi="Times New Roman" w:eastAsia="宋体"/>
+            <w:r>
+              <w:rPr>
+                <w:rFonts w:ascii="Times New Roman" w:hAnsi="Times New Roman" w:cs="Times New Roman" w:eastAsia="宋体"/>
                 <w:b/>
-                <w:sz w:val="16"/>
+                <w:sz w:val="15"/>
               </w:rPr>
               <w:t>考核内容</w:t>
             </w:r>
@@ -5632,15 +5628,14 @@
           </w:tcPr>
           <w:p>
             <w:pPr>
-              <w:spacing w:line="269" w:lineRule="auto" w:before="0" w:after="0"/>
+              <w:spacing w:line="240" w:lineRule="auto" w:before="0" w:after="0"/>
               <w:jc w:val="center"/>
             </w:pPr>
-            <w:r/>
-            <w:r>
-              <w:rPr>
-                <w:rFonts w:ascii="Times New Roman" w:hAnsi="Times New Roman" w:eastAsia="宋体"/>
+            <w:r>
+              <w:rPr>
+                <w:rFonts w:ascii="Times New Roman" w:hAnsi="Times New Roman" w:cs="Times New Roman" w:eastAsia="宋体"/>
                 <w:b/>
-                <w:sz w:val="16"/>
+                <w:sz w:val="15"/>
               </w:rPr>
               <w:t>总学时</w:t>
             </w:r>
@@ -5659,15 +5654,14 @@
           </w:tcPr>
           <w:p>
             <w:pPr>
-              <w:spacing w:line="269" w:lineRule="auto" w:before="0" w:after="0"/>
+              <w:spacing w:line="240" w:lineRule="auto" w:before="0" w:after="0"/>
               <w:jc w:val="center"/>
             </w:pPr>
-            <w:r/>
-            <w:r>
-              <w:rPr>
-                <w:rFonts w:ascii="Times New Roman" w:hAnsi="Times New Roman" w:eastAsia="宋体"/>
+            <w:r>
+              <w:rPr>
+                <w:rFonts w:ascii="Times New Roman" w:hAnsi="Times New Roman" w:cs="Times New Roman" w:eastAsia="宋体"/>
                 <w:b/>
-                <w:sz w:val="16"/>
+                <w:sz w:val="15"/>
               </w:rPr>
               <w:t>理论学时</w:t>
             </w:r>
@@ -5686,15 +5680,14 @@
           </w:tcPr>
           <w:p>
             <w:pPr>
-              <w:spacing w:line="269" w:lineRule="auto" w:before="0" w:after="0"/>
+              <w:spacing w:line="240" w:lineRule="auto" w:before="0" w:after="0"/>
               <w:jc w:val="center"/>
             </w:pPr>
-            <w:r/>
-            <w:r>
-              <w:rPr>
-                <w:rFonts w:ascii="Times New Roman" w:hAnsi="Times New Roman" w:eastAsia="宋体"/>
+            <w:r>
+              <w:rPr>
+                <w:rFonts w:ascii="Times New Roman" w:hAnsi="Times New Roman" w:cs="Times New Roman" w:eastAsia="宋体"/>
                 <w:b/>
-                <w:sz w:val="16"/>
+                <w:sz w:val="15"/>
               </w:rPr>
               <w:t>上机学时</w:t>
             </w:r>
@@ -5713,17 +5706,16 @@
           </w:tcPr>
           <w:p>
             <w:pPr>
-              <w:spacing w:line="269" w:lineRule="auto" w:before="0" w:after="0"/>
+              <w:spacing w:line="240" w:lineRule="auto" w:before="0" w:after="0"/>
               <w:jc w:val="center"/>
             </w:pPr>
-            <w:r/>
-            <w:r>
-              <w:rPr>
-                <w:rFonts w:ascii="Times New Roman" w:hAnsi="Times New Roman" w:eastAsia="宋体"/>
+            <w:r>
+              <w:rPr>
+                <w:rFonts w:ascii="Times New Roman" w:hAnsi="Times New Roman" w:cs="Times New Roman" w:eastAsia="宋体"/>
                 <w:b/>
-                <w:sz w:val="16"/>
-              </w:rPr>
-              <w:t>平时记录（15%）</w:t>
+                <w:sz w:val="15"/>
+              </w:rPr>
+              <w:t>平时成绩（20%）</w:t>
             </w:r>
           </w:p>
         </w:tc>
@@ -5740,17 +5732,16 @@
           </w:tcPr>
           <w:p>
             <w:pPr>
-              <w:spacing w:line="269" w:lineRule="auto" w:before="0" w:after="0"/>
+              <w:spacing w:line="240" w:lineRule="auto" w:before="0" w:after="0"/>
               <w:jc w:val="center"/>
             </w:pPr>
-            <w:r/>
-            <w:r>
-              <w:rPr>
-                <w:rFonts w:ascii="Times New Roman" w:hAnsi="Times New Roman" w:eastAsia="宋体"/>
+            <w:r>
+              <w:rPr>
+                <w:rFonts w:ascii="Times New Roman" w:hAnsi="Times New Roman" w:cs="Times New Roman" w:eastAsia="宋体"/>
                 <w:b/>
-                <w:sz w:val="16"/>
-              </w:rPr>
-              <w:t>上机任务（35%）</w:t>
+                <w:sz w:val="15"/>
+              </w:rPr>
+              <w:t>课程作业（20%）</w:t>
             </w:r>
           </w:p>
         </w:tc>
@@ -5767,44 +5758,16 @@
           </w:tcPr>
           <w:p>
             <w:pPr>
-              <w:spacing w:line="269" w:lineRule="auto" w:before="0" w:after="0"/>
+              <w:spacing w:line="240" w:lineRule="auto" w:before="0" w:after="0"/>
               <w:jc w:val="center"/>
             </w:pPr>
-            <w:r/>
-            <w:r>
-              <w:rPr>
-                <w:rFonts w:ascii="Times New Roman" w:hAnsi="Times New Roman" w:eastAsia="宋体"/>
+            <w:r>
+              <w:rPr>
+                <w:rFonts w:ascii="Times New Roman" w:hAnsi="Times New Roman" w:cs="Times New Roman" w:eastAsia="宋体"/>
                 <w:b/>
-                <w:sz w:val="16"/>
-              </w:rPr>
-              <w:t>综合成果（40%）</w:t>
-            </w:r>
-          </w:p>
-        </w:tc>
-        <w:tc>
-          <w:tcPr>
-            <w:tcW w:type="dxa" w:w="959"/>
-            <w:tcMar>
-              <w:top w:w="80" w:type="dxa"/>
-              <w:start w:w="70" w:type="dxa"/>
-              <w:bottom w:w="80" w:type="dxa"/>
-              <w:end w:w="70" w:type="dxa"/>
-            </w:tcMar>
-            <w:vAlign w:val="center"/>
-          </w:tcPr>
-          <w:p>
-            <w:pPr>
-              <w:spacing w:line="269" w:lineRule="auto" w:before="0" w:after="0"/>
-              <w:jc w:val="center"/>
-            </w:pPr>
-            <w:r/>
-            <w:r>
-              <w:rPr>
-                <w:rFonts w:ascii="Times New Roman" w:hAnsi="Times New Roman" w:eastAsia="宋体"/>
-                <w:b/>
-                <w:sz w:val="16"/>
-              </w:rPr>
-              <w:t>个人核验（10%）</w:t>
+                <w:sz w:val="15"/>
+              </w:rPr>
+              <w:t>期末综合考查（60%）</w:t>
             </w:r>
           </w:p>
         </w:tc>
@@ -5821,15 +5784,14 @@
           </w:tcPr>
           <w:p>
             <w:pPr>
-              <w:spacing w:line="269" w:lineRule="auto" w:before="0" w:after="0"/>
+              <w:spacing w:line="240" w:lineRule="auto" w:before="0" w:after="0"/>
               <w:jc w:val="center"/>
             </w:pPr>
-            <w:r/>
-            <w:r>
-              <w:rPr>
-                <w:rFonts w:ascii="Times New Roman" w:hAnsi="Times New Roman" w:eastAsia="宋体"/>
+            <w:r>
+              <w:rPr>
+                <w:rFonts w:ascii="Times New Roman" w:hAnsi="Times New Roman" w:cs="Times New Roman" w:eastAsia="宋体"/>
                 <w:b/>
-                <w:sz w:val="16"/>
+                <w:sz w:val="15"/>
               </w:rPr>
               <w:t>课程目标</w:t>
             </w:r>
@@ -5850,15 +5812,14 @@
           </w:tcPr>
           <w:p>
             <w:pPr>
-              <w:spacing w:line="269" w:lineRule="auto" w:before="0" w:after="0"/>
+              <w:spacing w:line="240" w:lineRule="auto" w:before="0" w:after="0"/>
               <w:jc w:val="left"/>
             </w:pPr>
-            <w:r/>
-            <w:r>
-              <w:rPr>
-                <w:rFonts w:ascii="Times New Roman" w:hAnsi="Times New Roman" w:eastAsia="宋体"/>
-                <w:b w:val="0"/>
-                <w:sz w:val="16"/>
+            <w:r>
+              <w:rPr>
+                <w:rFonts w:ascii="Times New Roman" w:hAnsi="Times New Roman" w:cs="Times New Roman" w:eastAsia="宋体"/>
+                <w:b/>
+                <w:sz w:val="15"/>
               </w:rPr>
               <w:t>PLC系统、扫描原理与安全边界</w:t>
             </w:r>
@@ -5877,15 +5838,14 @@
           </w:tcPr>
           <w:p>
             <w:pPr>
-              <w:spacing w:line="269" w:lineRule="auto" w:before="0" w:after="0"/>
+              <w:spacing w:line="240" w:lineRule="auto" w:before="0" w:after="0"/>
               <w:jc w:val="center"/>
             </w:pPr>
-            <w:r/>
-            <w:r>
-              <w:rPr>
-                <w:rFonts w:ascii="Times New Roman" w:hAnsi="Times New Roman" w:eastAsia="宋体"/>
+            <w:r>
+              <w:rPr>
+                <w:rFonts w:ascii="Times New Roman" w:hAnsi="Times New Roman" w:cs="Times New Roman" w:eastAsia="宋体"/>
                 <w:b w:val="0"/>
-                <w:sz w:val="16"/>
+                <w:sz w:val="15"/>
               </w:rPr>
               <w:t>4</w:t>
             </w:r>
@@ -5904,15 +5864,14 @@
           </w:tcPr>
           <w:p>
             <w:pPr>
-              <w:spacing w:line="269" w:lineRule="auto" w:before="0" w:after="0"/>
+              <w:spacing w:line="240" w:lineRule="auto" w:before="0" w:after="0"/>
               <w:jc w:val="center"/>
             </w:pPr>
-            <w:r/>
-            <w:r>
-              <w:rPr>
-                <w:rFonts w:ascii="Times New Roman" w:hAnsi="Times New Roman" w:eastAsia="宋体"/>
+            <w:r>
+              <w:rPr>
+                <w:rFonts w:ascii="Times New Roman" w:hAnsi="Times New Roman" w:cs="Times New Roman" w:eastAsia="宋体"/>
                 <w:b w:val="0"/>
-                <w:sz w:val="16"/>
+                <w:sz w:val="15"/>
               </w:rPr>
               <w:t>2</w:t>
             </w:r>
@@ -5931,15 +5890,14 @@
           </w:tcPr>
           <w:p>
             <w:pPr>
-              <w:spacing w:line="269" w:lineRule="auto" w:before="0" w:after="0"/>
+              <w:spacing w:line="240" w:lineRule="auto" w:before="0" w:after="0"/>
               <w:jc w:val="center"/>
             </w:pPr>
-            <w:r/>
-            <w:r>
-              <w:rPr>
-                <w:rFonts w:ascii="Times New Roman" w:hAnsi="Times New Roman" w:eastAsia="宋体"/>
+            <w:r>
+              <w:rPr>
+                <w:rFonts w:ascii="Times New Roman" w:hAnsi="Times New Roman" w:cs="Times New Roman" w:eastAsia="宋体"/>
                 <w:b w:val="0"/>
-                <w:sz w:val="16"/>
+                <w:sz w:val="15"/>
               </w:rPr>
               <w:t>2</w:t>
             </w:r>
@@ -5958,15 +5916,14 @@
           </w:tcPr>
           <w:p>
             <w:pPr>
-              <w:spacing w:line="269" w:lineRule="auto" w:before="0" w:after="0"/>
-              <w:jc w:val="left"/>
-            </w:pPr>
-            <w:r/>
-            <w:r>
-              <w:rPr>
-                <w:rFonts w:ascii="Times New Roman" w:hAnsi="Times New Roman" w:eastAsia="宋体"/>
+              <w:spacing w:line="240" w:lineRule="auto" w:before="0" w:after="0"/>
+              <w:jc w:val="center"/>
+            </w:pPr>
+            <w:r>
+              <w:rPr>
+                <w:rFonts w:ascii="Times New Roman" w:hAnsi="Times New Roman" w:cs="Times New Roman" w:eastAsia="宋体"/>
                 <w:b w:val="0"/>
-                <w:sz w:val="16"/>
+                <w:sz w:val="15"/>
               </w:rPr>
               <w:t>10%</w:t>
             </w:r>
@@ -5985,15 +5942,14 @@
           </w:tcPr>
           <w:p>
             <w:pPr>
-              <w:spacing w:line="269" w:lineRule="auto" w:before="0" w:after="0"/>
-              <w:jc w:val="left"/>
-            </w:pPr>
-            <w:r/>
-            <w:r>
-              <w:rPr>
-                <w:rFonts w:ascii="Times New Roman" w:hAnsi="Times New Roman" w:eastAsia="宋体"/>
+              <w:spacing w:line="240" w:lineRule="auto" w:before="0" w:after="0"/>
+              <w:jc w:val="center"/>
+            </w:pPr>
+            <w:r>
+              <w:rPr>
+                <w:rFonts w:ascii="Times New Roman" w:hAnsi="Times New Roman" w:cs="Times New Roman" w:eastAsia="宋体"/>
                 <w:b w:val="0"/>
-                <w:sz w:val="16"/>
+                <w:sz w:val="15"/>
               </w:rPr>
               <w:t>10%</w:t>
             </w:r>
@@ -6012,42 +5968,14 @@
           </w:tcPr>
           <w:p>
             <w:pPr>
-              <w:spacing w:line="269" w:lineRule="auto" w:before="0" w:after="0"/>
-              <w:jc w:val="left"/>
-            </w:pPr>
-            <w:r/>
-            <w:r>
-              <w:rPr>
-                <w:rFonts w:ascii="Times New Roman" w:hAnsi="Times New Roman" w:eastAsia="宋体"/>
+              <w:spacing w:line="240" w:lineRule="auto" w:before="0" w:after="0"/>
+              <w:jc w:val="center"/>
+            </w:pPr>
+            <w:r>
+              <w:rPr>
+                <w:rFonts w:ascii="Times New Roman" w:hAnsi="Times New Roman" w:cs="Times New Roman" w:eastAsia="宋体"/>
                 <w:b w:val="0"/>
-                <w:sz w:val="16"/>
-              </w:rPr>
-              <w:t>10%</w:t>
-            </w:r>
-          </w:p>
-        </w:tc>
-        <w:tc>
-          <w:tcPr>
-            <w:tcW w:type="dxa" w:w="959"/>
-            <w:vAlign w:val="center"/>
-            <w:tcMar>
-              <w:top w:w="80" w:type="dxa"/>
-              <w:start w:w="70" w:type="dxa"/>
-              <w:bottom w:w="80" w:type="dxa"/>
-              <w:end w:w="70" w:type="dxa"/>
-            </w:tcMar>
-          </w:tcPr>
-          <w:p>
-            <w:pPr>
-              <w:spacing w:line="269" w:lineRule="auto" w:before="0" w:after="0"/>
-              <w:jc w:val="left"/>
-            </w:pPr>
-            <w:r/>
-            <w:r>
-              <w:rPr>
-                <w:rFonts w:ascii="Times New Roman" w:hAnsi="Times New Roman" w:eastAsia="宋体"/>
-                <w:b w:val="0"/>
-                <w:sz w:val="16"/>
+                <w:sz w:val="15"/>
               </w:rPr>
               <w:t>10%</w:t>
             </w:r>
@@ -6066,15 +5994,14 @@
           </w:tcPr>
           <w:p>
             <w:pPr>
-              <w:spacing w:line="269" w:lineRule="auto" w:before="0" w:after="0"/>
-              <w:jc w:val="left"/>
-            </w:pPr>
-            <w:r/>
-            <w:r>
-              <w:rPr>
-                <w:rFonts w:ascii="Times New Roman" w:hAnsi="Times New Roman" w:eastAsia="宋体"/>
+              <w:spacing w:line="240" w:lineRule="auto" w:before="0" w:after="0"/>
+              <w:jc w:val="center"/>
+            </w:pPr>
+            <w:r>
+              <w:rPr>
+                <w:rFonts w:ascii="Times New Roman" w:hAnsi="Times New Roman" w:cs="Times New Roman" w:eastAsia="宋体"/>
                 <w:b w:val="0"/>
-                <w:sz w:val="16"/>
+                <w:sz w:val="15"/>
               </w:rPr>
               <w:t>目标 1.1，2.1，3.1</w:t>
             </w:r>
@@ -6095,15 +6022,14 @@
           </w:tcPr>
           <w:p>
             <w:pPr>
-              <w:spacing w:line="269" w:lineRule="auto" w:before="0" w:after="0"/>
+              <w:spacing w:line="240" w:lineRule="auto" w:before="0" w:after="0"/>
               <w:jc w:val="left"/>
             </w:pPr>
-            <w:r/>
-            <w:r>
-              <w:rPr>
-                <w:rFonts w:ascii="Times New Roman" w:hAnsi="Times New Roman" w:eastAsia="宋体"/>
-                <w:b w:val="0"/>
-                <w:sz w:val="16"/>
+            <w:r>
+              <w:rPr>
+                <w:rFonts w:ascii="Times New Roman" w:hAnsi="Times New Roman" w:cs="Times New Roman" w:eastAsia="宋体"/>
+                <w:b/>
+                <w:sz w:val="15"/>
               </w:rPr>
               <w:t>基本指令与数字量控制</w:t>
             </w:r>
@@ -6122,15 +6048,14 @@
           </w:tcPr>
           <w:p>
             <w:pPr>
-              <w:spacing w:line="269" w:lineRule="auto" w:before="0" w:after="0"/>
+              <w:spacing w:line="240" w:lineRule="auto" w:before="0" w:after="0"/>
               <w:jc w:val="center"/>
             </w:pPr>
-            <w:r/>
-            <w:r>
-              <w:rPr>
-                <w:rFonts w:ascii="Times New Roman" w:hAnsi="Times New Roman" w:eastAsia="宋体"/>
+            <w:r>
+              <w:rPr>
+                <w:rFonts w:ascii="Times New Roman" w:hAnsi="Times New Roman" w:cs="Times New Roman" w:eastAsia="宋体"/>
                 <w:b w:val="0"/>
-                <w:sz w:val="16"/>
+                <w:sz w:val="15"/>
               </w:rPr>
               <w:t>6</w:t>
             </w:r>
@@ -6149,15 +6074,14 @@
           </w:tcPr>
           <w:p>
             <w:pPr>
-              <w:spacing w:line="269" w:lineRule="auto" w:before="0" w:after="0"/>
+              <w:spacing w:line="240" w:lineRule="auto" w:before="0" w:after="0"/>
               <w:jc w:val="center"/>
             </w:pPr>
-            <w:r/>
-            <w:r>
-              <w:rPr>
-                <w:rFonts w:ascii="Times New Roman" w:hAnsi="Times New Roman" w:eastAsia="宋体"/>
+            <w:r>
+              <w:rPr>
+                <w:rFonts w:ascii="Times New Roman" w:hAnsi="Times New Roman" w:cs="Times New Roman" w:eastAsia="宋体"/>
                 <w:b w:val="0"/>
-                <w:sz w:val="16"/>
+                <w:sz w:val="15"/>
               </w:rPr>
               <w:t>4</w:t>
             </w:r>
@@ -6176,15 +6100,14 @@
           </w:tcPr>
           <w:p>
             <w:pPr>
-              <w:spacing w:line="269" w:lineRule="auto" w:before="0" w:after="0"/>
+              <w:spacing w:line="240" w:lineRule="auto" w:before="0" w:after="0"/>
               <w:jc w:val="center"/>
             </w:pPr>
-            <w:r/>
-            <w:r>
-              <w:rPr>
-                <w:rFonts w:ascii="Times New Roman" w:hAnsi="Times New Roman" w:eastAsia="宋体"/>
+            <w:r>
+              <w:rPr>
+                <w:rFonts w:ascii="Times New Roman" w:hAnsi="Times New Roman" w:cs="Times New Roman" w:eastAsia="宋体"/>
                 <w:b w:val="0"/>
-                <w:sz w:val="16"/>
+                <w:sz w:val="15"/>
               </w:rPr>
               <w:t>2</w:t>
             </w:r>
@@ -6203,15 +6126,14 @@
           </w:tcPr>
           <w:p>
             <w:pPr>
-              <w:spacing w:line="269" w:lineRule="auto" w:before="0" w:after="0"/>
-              <w:jc w:val="left"/>
-            </w:pPr>
-            <w:r/>
-            <w:r>
-              <w:rPr>
-                <w:rFonts w:ascii="Times New Roman" w:hAnsi="Times New Roman" w:eastAsia="宋体"/>
+              <w:spacing w:line="240" w:lineRule="auto" w:before="0" w:after="0"/>
+              <w:jc w:val="center"/>
+            </w:pPr>
+            <w:r>
+              <w:rPr>
+                <w:rFonts w:ascii="Times New Roman" w:hAnsi="Times New Roman" w:cs="Times New Roman" w:eastAsia="宋体"/>
                 <w:b w:val="0"/>
-                <w:sz w:val="16"/>
+                <w:sz w:val="15"/>
               </w:rPr>
               <w:t>20%</w:t>
             </w:r>
@@ -6230,15 +6152,14 @@
           </w:tcPr>
           <w:p>
             <w:pPr>
-              <w:spacing w:line="269" w:lineRule="auto" w:before="0" w:after="0"/>
-              <w:jc w:val="left"/>
-            </w:pPr>
-            <w:r/>
-            <w:r>
-              <w:rPr>
-                <w:rFonts w:ascii="Times New Roman" w:hAnsi="Times New Roman" w:eastAsia="宋体"/>
+              <w:spacing w:line="240" w:lineRule="auto" w:before="0" w:after="0"/>
+              <w:jc w:val="center"/>
+            </w:pPr>
+            <w:r>
+              <w:rPr>
+                <w:rFonts w:ascii="Times New Roman" w:hAnsi="Times New Roman" w:cs="Times New Roman" w:eastAsia="宋体"/>
                 <w:b w:val="0"/>
-                <w:sz w:val="16"/>
+                <w:sz w:val="15"/>
               </w:rPr>
               <w:t>15%</w:t>
             </w:r>
@@ -6257,42 +6178,14 @@
           </w:tcPr>
           <w:p>
             <w:pPr>
-              <w:spacing w:line="269" w:lineRule="auto" w:before="0" w:after="0"/>
-              <w:jc w:val="left"/>
-            </w:pPr>
-            <w:r/>
-            <w:r>
-              <w:rPr>
-                <w:rFonts w:ascii="Times New Roman" w:hAnsi="Times New Roman" w:eastAsia="宋体"/>
+              <w:spacing w:line="240" w:lineRule="auto" w:before="0" w:after="0"/>
+              <w:jc w:val="center"/>
+            </w:pPr>
+            <w:r>
+              <w:rPr>
+                <w:rFonts w:ascii="Times New Roman" w:hAnsi="Times New Roman" w:cs="Times New Roman" w:eastAsia="宋体"/>
                 <w:b w:val="0"/>
-                <w:sz w:val="16"/>
-              </w:rPr>
-              <w:t>20%</w:t>
-            </w:r>
-          </w:p>
-        </w:tc>
-        <w:tc>
-          <w:tcPr>
-            <w:tcW w:type="dxa" w:w="959"/>
-            <w:vAlign w:val="center"/>
-            <w:tcMar>
-              <w:top w:w="80" w:type="dxa"/>
-              <w:start w:w="70" w:type="dxa"/>
-              <w:bottom w:w="80" w:type="dxa"/>
-              <w:end w:w="70" w:type="dxa"/>
-            </w:tcMar>
-          </w:tcPr>
-          <w:p>
-            <w:pPr>
-              <w:spacing w:line="269" w:lineRule="auto" w:before="0" w:after="0"/>
-              <w:jc w:val="left"/>
-            </w:pPr>
-            <w:r/>
-            <w:r>
-              <w:rPr>
-                <w:rFonts w:ascii="Times New Roman" w:hAnsi="Times New Roman" w:eastAsia="宋体"/>
-                <w:b w:val="0"/>
-                <w:sz w:val="16"/>
+                <w:sz w:val="15"/>
               </w:rPr>
               <w:t>20%</w:t>
             </w:r>
@@ -6311,15 +6204,14 @@
           </w:tcPr>
           <w:p>
             <w:pPr>
-              <w:spacing w:line="269" w:lineRule="auto" w:before="0" w:after="0"/>
-              <w:jc w:val="left"/>
-            </w:pPr>
-            <w:r/>
-            <w:r>
-              <w:rPr>
-                <w:rFonts w:ascii="Times New Roman" w:hAnsi="Times New Roman" w:eastAsia="宋体"/>
+              <w:spacing w:line="240" w:lineRule="auto" w:before="0" w:after="0"/>
+              <w:jc w:val="center"/>
+            </w:pPr>
+            <w:r>
+              <w:rPr>
+                <w:rFonts w:ascii="Times New Roman" w:hAnsi="Times New Roman" w:cs="Times New Roman" w:eastAsia="宋体"/>
                 <w:b w:val="0"/>
-                <w:sz w:val="16"/>
+                <w:sz w:val="15"/>
               </w:rPr>
               <w:t>目标 1.2，2.2，3.2</w:t>
             </w:r>
@@ -6340,15 +6232,14 @@
           </w:tcPr>
           <w:p>
             <w:pPr>
-              <w:spacing w:line="269" w:lineRule="auto" w:before="0" w:after="0"/>
+              <w:spacing w:line="240" w:lineRule="auto" w:before="0" w:after="0"/>
               <w:jc w:val="left"/>
             </w:pPr>
-            <w:r/>
-            <w:r>
-              <w:rPr>
-                <w:rFonts w:ascii="Times New Roman" w:hAnsi="Times New Roman" w:eastAsia="宋体"/>
-                <w:b w:val="0"/>
-                <w:sz w:val="16"/>
+            <w:r>
+              <w:rPr>
+                <w:rFonts w:ascii="Times New Roman" w:hAnsi="Times New Roman" w:cs="Times New Roman" w:eastAsia="宋体"/>
+                <w:b/>
+                <w:sz w:val="15"/>
               </w:rPr>
               <w:t>程序结构与顺序控制</w:t>
             </w:r>
@@ -6367,15 +6258,14 @@
           </w:tcPr>
           <w:p>
             <w:pPr>
-              <w:spacing w:line="269" w:lineRule="auto" w:before="0" w:after="0"/>
+              <w:spacing w:line="240" w:lineRule="auto" w:before="0" w:after="0"/>
               <w:jc w:val="center"/>
             </w:pPr>
-            <w:r/>
-            <w:r>
-              <w:rPr>
-                <w:rFonts w:ascii="Times New Roman" w:hAnsi="Times New Roman" w:eastAsia="宋体"/>
+            <w:r>
+              <w:rPr>
+                <w:rFonts w:ascii="Times New Roman" w:hAnsi="Times New Roman" w:cs="Times New Roman" w:eastAsia="宋体"/>
                 <w:b w:val="0"/>
-                <w:sz w:val="16"/>
+                <w:sz w:val="15"/>
               </w:rPr>
               <w:t>8</w:t>
             </w:r>
@@ -6394,15 +6284,14 @@
           </w:tcPr>
           <w:p>
             <w:pPr>
-              <w:spacing w:line="269" w:lineRule="auto" w:before="0" w:after="0"/>
+              <w:spacing w:line="240" w:lineRule="auto" w:before="0" w:after="0"/>
               <w:jc w:val="center"/>
             </w:pPr>
-            <w:r/>
-            <w:r>
-              <w:rPr>
-                <w:rFonts w:ascii="Times New Roman" w:hAnsi="Times New Roman" w:eastAsia="宋体"/>
+            <w:r>
+              <w:rPr>
+                <w:rFonts w:ascii="Times New Roman" w:hAnsi="Times New Roman" w:cs="Times New Roman" w:eastAsia="宋体"/>
                 <w:b w:val="0"/>
-                <w:sz w:val="16"/>
+                <w:sz w:val="15"/>
               </w:rPr>
               <w:t>4</w:t>
             </w:r>
@@ -6421,15 +6310,14 @@
           </w:tcPr>
           <w:p>
             <w:pPr>
-              <w:spacing w:line="269" w:lineRule="auto" w:before="0" w:after="0"/>
+              <w:spacing w:line="240" w:lineRule="auto" w:before="0" w:after="0"/>
               <w:jc w:val="center"/>
             </w:pPr>
-            <w:r/>
-            <w:r>
-              <w:rPr>
-                <w:rFonts w:ascii="Times New Roman" w:hAnsi="Times New Roman" w:eastAsia="宋体"/>
+            <w:r>
+              <w:rPr>
+                <w:rFonts w:ascii="Times New Roman" w:hAnsi="Times New Roman" w:cs="Times New Roman" w:eastAsia="宋体"/>
                 <w:b w:val="0"/>
-                <w:sz w:val="16"/>
+                <w:sz w:val="15"/>
               </w:rPr>
               <w:t>4</w:t>
             </w:r>
@@ -6448,15 +6336,14 @@
           </w:tcPr>
           <w:p>
             <w:pPr>
-              <w:spacing w:line="269" w:lineRule="auto" w:before="0" w:after="0"/>
-              <w:jc w:val="left"/>
-            </w:pPr>
-            <w:r/>
-            <w:r>
-              <w:rPr>
-                <w:rFonts w:ascii="Times New Roman" w:hAnsi="Times New Roman" w:eastAsia="宋体"/>
+              <w:spacing w:line="240" w:lineRule="auto" w:before="0" w:after="0"/>
+              <w:jc w:val="center"/>
+            </w:pPr>
+            <w:r>
+              <w:rPr>
+                <w:rFonts w:ascii="Times New Roman" w:hAnsi="Times New Roman" w:cs="Times New Roman" w:eastAsia="宋体"/>
                 <w:b w:val="0"/>
-                <w:sz w:val="16"/>
+                <w:sz w:val="15"/>
               </w:rPr>
               <w:t>20%</w:t>
             </w:r>
@@ -6475,15 +6362,14 @@
           </w:tcPr>
           <w:p>
             <w:pPr>
-              <w:spacing w:line="269" w:lineRule="auto" w:before="0" w:after="0"/>
-              <w:jc w:val="left"/>
-            </w:pPr>
-            <w:r/>
-            <w:r>
-              <w:rPr>
-                <w:rFonts w:ascii="Times New Roman" w:hAnsi="Times New Roman" w:eastAsia="宋体"/>
+              <w:spacing w:line="240" w:lineRule="auto" w:before="0" w:after="0"/>
+              <w:jc w:val="center"/>
+            </w:pPr>
+            <w:r>
+              <w:rPr>
+                <w:rFonts w:ascii="Times New Roman" w:hAnsi="Times New Roman" w:cs="Times New Roman" w:eastAsia="宋体"/>
                 <w:b w:val="0"/>
-                <w:sz w:val="16"/>
+                <w:sz w:val="15"/>
               </w:rPr>
               <w:t>25%</w:t>
             </w:r>
@@ -6502,42 +6388,14 @@
           </w:tcPr>
           <w:p>
             <w:pPr>
-              <w:spacing w:line="269" w:lineRule="auto" w:before="0" w:after="0"/>
-              <w:jc w:val="left"/>
-            </w:pPr>
-            <w:r/>
-            <w:r>
-              <w:rPr>
-                <w:rFonts w:ascii="Times New Roman" w:hAnsi="Times New Roman" w:eastAsia="宋体"/>
+              <w:spacing w:line="240" w:lineRule="auto" w:before="0" w:after="0"/>
+              <w:jc w:val="center"/>
+            </w:pPr>
+            <w:r>
+              <w:rPr>
+                <w:rFonts w:ascii="Times New Roman" w:hAnsi="Times New Roman" w:cs="Times New Roman" w:eastAsia="宋体"/>
                 <w:b w:val="0"/>
-                <w:sz w:val="16"/>
-              </w:rPr>
-              <w:t>20%</w:t>
-            </w:r>
-          </w:p>
-        </w:tc>
-        <w:tc>
-          <w:tcPr>
-            <w:tcW w:type="dxa" w:w="959"/>
-            <w:vAlign w:val="center"/>
-            <w:tcMar>
-              <w:top w:w="80" w:type="dxa"/>
-              <w:start w:w="70" w:type="dxa"/>
-              <w:bottom w:w="80" w:type="dxa"/>
-              <w:end w:w="70" w:type="dxa"/>
-            </w:tcMar>
-          </w:tcPr>
-          <w:p>
-            <w:pPr>
-              <w:spacing w:line="269" w:lineRule="auto" w:before="0" w:after="0"/>
-              <w:jc w:val="left"/>
-            </w:pPr>
-            <w:r/>
-            <w:r>
-              <w:rPr>
-                <w:rFonts w:ascii="Times New Roman" w:hAnsi="Times New Roman" w:eastAsia="宋体"/>
-                <w:b w:val="0"/>
-                <w:sz w:val="16"/>
+                <w:sz w:val="15"/>
               </w:rPr>
               <w:t>20%</w:t>
             </w:r>
@@ -6556,15 +6414,14 @@
           </w:tcPr>
           <w:p>
             <w:pPr>
-              <w:spacing w:line="269" w:lineRule="auto" w:before="0" w:after="0"/>
-              <w:jc w:val="left"/>
-            </w:pPr>
-            <w:r/>
-            <w:r>
-              <w:rPr>
-                <w:rFonts w:ascii="Times New Roman" w:hAnsi="Times New Roman" w:eastAsia="宋体"/>
+              <w:spacing w:line="240" w:lineRule="auto" w:before="0" w:after="0"/>
+              <w:jc w:val="center"/>
+            </w:pPr>
+            <w:r>
+              <w:rPr>
+                <w:rFonts w:ascii="Times New Roman" w:hAnsi="Times New Roman" w:cs="Times New Roman" w:eastAsia="宋体"/>
                 <w:b w:val="0"/>
-                <w:sz w:val="16"/>
+                <w:sz w:val="15"/>
               </w:rPr>
               <w:t>目标 1.3，2.3，3.3</w:t>
             </w:r>
@@ -6585,15 +6442,14 @@
           </w:tcPr>
           <w:p>
             <w:pPr>
-              <w:spacing w:line="269" w:lineRule="auto" w:before="0" w:after="0"/>
+              <w:spacing w:line="240" w:lineRule="auto" w:before="0" w:after="0"/>
               <w:jc w:val="left"/>
             </w:pPr>
-            <w:r/>
-            <w:r>
-              <w:rPr>
-                <w:rFonts w:ascii="Times New Roman" w:hAnsi="Times New Roman" w:eastAsia="宋体"/>
-                <w:b w:val="0"/>
-                <w:sz w:val="16"/>
+            <w:r>
+              <w:rPr>
+                <w:rFonts w:ascii="Times New Roman" w:hAnsi="Times New Roman" w:cs="Times New Roman" w:eastAsia="宋体"/>
+                <w:b/>
+                <w:sz w:val="15"/>
               </w:rPr>
               <w:t>模拟量与过程监控基础</w:t>
             </w:r>
@@ -6612,15 +6468,14 @@
           </w:tcPr>
           <w:p>
             <w:pPr>
-              <w:spacing w:line="269" w:lineRule="auto" w:before="0" w:after="0"/>
+              <w:spacing w:line="240" w:lineRule="auto" w:before="0" w:after="0"/>
               <w:jc w:val="center"/>
             </w:pPr>
-            <w:r/>
-            <w:r>
-              <w:rPr>
-                <w:rFonts w:ascii="Times New Roman" w:hAnsi="Times New Roman" w:eastAsia="宋体"/>
+            <w:r>
+              <w:rPr>
+                <w:rFonts w:ascii="Times New Roman" w:hAnsi="Times New Roman" w:cs="Times New Roman" w:eastAsia="宋体"/>
                 <w:b w:val="0"/>
-                <w:sz w:val="16"/>
+                <w:sz w:val="15"/>
               </w:rPr>
               <w:t>4</w:t>
             </w:r>
@@ -6639,15 +6494,14 @@
           </w:tcPr>
           <w:p>
             <w:pPr>
-              <w:spacing w:line="269" w:lineRule="auto" w:before="0" w:after="0"/>
+              <w:spacing w:line="240" w:lineRule="auto" w:before="0" w:after="0"/>
               <w:jc w:val="center"/>
             </w:pPr>
-            <w:r/>
-            <w:r>
-              <w:rPr>
-                <w:rFonts w:ascii="Times New Roman" w:hAnsi="Times New Roman" w:eastAsia="宋体"/>
+            <w:r>
+              <w:rPr>
+                <w:rFonts w:ascii="Times New Roman" w:hAnsi="Times New Roman" w:cs="Times New Roman" w:eastAsia="宋体"/>
                 <w:b w:val="0"/>
-                <w:sz w:val="16"/>
+                <w:sz w:val="15"/>
               </w:rPr>
               <w:t>2</w:t>
             </w:r>
@@ -6666,15 +6520,14 @@
           </w:tcPr>
           <w:p>
             <w:pPr>
-              <w:spacing w:line="269" w:lineRule="auto" w:before="0" w:after="0"/>
+              <w:spacing w:line="240" w:lineRule="auto" w:before="0" w:after="0"/>
               <w:jc w:val="center"/>
             </w:pPr>
-            <w:r/>
-            <w:r>
-              <w:rPr>
-                <w:rFonts w:ascii="Times New Roman" w:hAnsi="Times New Roman" w:eastAsia="宋体"/>
+            <w:r>
+              <w:rPr>
+                <w:rFonts w:ascii="Times New Roman" w:hAnsi="Times New Roman" w:cs="Times New Roman" w:eastAsia="宋体"/>
                 <w:b w:val="0"/>
-                <w:sz w:val="16"/>
+                <w:sz w:val="15"/>
               </w:rPr>
               <w:t>2</w:t>
             </w:r>
@@ -6693,15 +6546,14 @@
           </w:tcPr>
           <w:p>
             <w:pPr>
-              <w:spacing w:line="269" w:lineRule="auto" w:before="0" w:after="0"/>
-              <w:jc w:val="left"/>
-            </w:pPr>
-            <w:r/>
-            <w:r>
-              <w:rPr>
-                <w:rFonts w:ascii="Times New Roman" w:hAnsi="Times New Roman" w:eastAsia="宋体"/>
+              <w:spacing w:line="240" w:lineRule="auto" w:before="0" w:after="0"/>
+              <w:jc w:val="center"/>
+            </w:pPr>
+            <w:r>
+              <w:rPr>
+                <w:rFonts w:ascii="Times New Roman" w:hAnsi="Times New Roman" w:cs="Times New Roman" w:eastAsia="宋体"/>
                 <w:b w:val="0"/>
-                <w:sz w:val="16"/>
+                <w:sz w:val="15"/>
               </w:rPr>
               <w:t>15%</w:t>
             </w:r>
@@ -6720,15 +6572,14 @@
           </w:tcPr>
           <w:p>
             <w:pPr>
-              <w:spacing w:line="269" w:lineRule="auto" w:before="0" w:after="0"/>
-              <w:jc w:val="left"/>
-            </w:pPr>
-            <w:r/>
-            <w:r>
-              <w:rPr>
-                <w:rFonts w:ascii="Times New Roman" w:hAnsi="Times New Roman" w:eastAsia="宋体"/>
+              <w:spacing w:line="240" w:lineRule="auto" w:before="0" w:after="0"/>
+              <w:jc w:val="center"/>
+            </w:pPr>
+            <w:r>
+              <w:rPr>
+                <w:rFonts w:ascii="Times New Roman" w:hAnsi="Times New Roman" w:cs="Times New Roman" w:eastAsia="宋体"/>
                 <w:b w:val="0"/>
-                <w:sz w:val="16"/>
+                <w:sz w:val="15"/>
               </w:rPr>
               <w:t>15%</w:t>
             </w:r>
@@ -6747,42 +6598,14 @@
           </w:tcPr>
           <w:p>
             <w:pPr>
-              <w:spacing w:line="269" w:lineRule="auto" w:before="0" w:after="0"/>
-              <w:jc w:val="left"/>
-            </w:pPr>
-            <w:r/>
-            <w:r>
-              <w:rPr>
-                <w:rFonts w:ascii="Times New Roman" w:hAnsi="Times New Roman" w:eastAsia="宋体"/>
+              <w:spacing w:line="240" w:lineRule="auto" w:before="0" w:after="0"/>
+              <w:jc w:val="center"/>
+            </w:pPr>
+            <w:r>
+              <w:rPr>
+                <w:rFonts w:ascii="Times New Roman" w:hAnsi="Times New Roman" w:cs="Times New Roman" w:eastAsia="宋体"/>
                 <w:b w:val="0"/>
-                <w:sz w:val="16"/>
-              </w:rPr>
-              <w:t>15%</w:t>
-            </w:r>
-          </w:p>
-        </w:tc>
-        <w:tc>
-          <w:tcPr>
-            <w:tcW w:type="dxa" w:w="959"/>
-            <w:vAlign w:val="center"/>
-            <w:tcMar>
-              <w:top w:w="80" w:type="dxa"/>
-              <w:start w:w="70" w:type="dxa"/>
-              <w:bottom w:w="80" w:type="dxa"/>
-              <w:end w:w="70" w:type="dxa"/>
-            </w:tcMar>
-          </w:tcPr>
-          <w:p>
-            <w:pPr>
-              <w:spacing w:line="269" w:lineRule="auto" w:before="0" w:after="0"/>
-              <w:jc w:val="left"/>
-            </w:pPr>
-            <w:r/>
-            <w:r>
-              <w:rPr>
-                <w:rFonts w:ascii="Times New Roman" w:hAnsi="Times New Roman" w:eastAsia="宋体"/>
-                <w:b w:val="0"/>
-                <w:sz w:val="16"/>
+                <w:sz w:val="15"/>
               </w:rPr>
               <w:t>15%</w:t>
             </w:r>
@@ -6801,15 +6624,14 @@
           </w:tcPr>
           <w:p>
             <w:pPr>
-              <w:spacing w:line="269" w:lineRule="auto" w:before="0" w:after="0"/>
-              <w:jc w:val="left"/>
-            </w:pPr>
-            <w:r/>
-            <w:r>
-              <w:rPr>
-                <w:rFonts w:ascii="Times New Roman" w:hAnsi="Times New Roman" w:eastAsia="宋体"/>
+              <w:spacing w:line="240" w:lineRule="auto" w:before="0" w:after="0"/>
+              <w:jc w:val="center"/>
+            </w:pPr>
+            <w:r>
+              <w:rPr>
+                <w:rFonts w:ascii="Times New Roman" w:hAnsi="Times New Roman" w:cs="Times New Roman" w:eastAsia="宋体"/>
                 <w:b w:val="0"/>
-                <w:sz w:val="16"/>
+                <w:sz w:val="15"/>
               </w:rPr>
               <w:t>目标 1.4，2.4，3.4</w:t>
             </w:r>
@@ -6830,15 +6652,14 @@
           </w:tcPr>
           <w:p>
             <w:pPr>
-              <w:spacing w:line="269" w:lineRule="auto" w:before="0" w:after="0"/>
+              <w:spacing w:line="240" w:lineRule="auto" w:before="0" w:after="0"/>
               <w:jc w:val="left"/>
             </w:pPr>
-            <w:r/>
-            <w:r>
-              <w:rPr>
-                <w:rFonts w:ascii="Times New Roman" w:hAnsi="Times New Roman" w:eastAsia="宋体"/>
-                <w:b w:val="0"/>
-                <w:sz w:val="16"/>
+            <w:r>
+              <w:rPr>
+                <w:rFonts w:ascii="Times New Roman" w:hAnsi="Times New Roman" w:cs="Times New Roman" w:eastAsia="宋体"/>
+                <w:b/>
+                <w:sz w:val="15"/>
               </w:rPr>
               <w:t>HMI与设备通信入门</w:t>
             </w:r>
@@ -6857,15 +6678,14 @@
           </w:tcPr>
           <w:p>
             <w:pPr>
-              <w:spacing w:line="269" w:lineRule="auto" w:before="0" w:after="0"/>
+              <w:spacing w:line="240" w:lineRule="auto" w:before="0" w:after="0"/>
               <w:jc w:val="center"/>
             </w:pPr>
-            <w:r/>
-            <w:r>
-              <w:rPr>
-                <w:rFonts w:ascii="Times New Roman" w:hAnsi="Times New Roman" w:eastAsia="宋体"/>
+            <w:r>
+              <w:rPr>
+                <w:rFonts w:ascii="Times New Roman" w:hAnsi="Times New Roman" w:cs="Times New Roman" w:eastAsia="宋体"/>
                 <w:b w:val="0"/>
-                <w:sz w:val="16"/>
+                <w:sz w:val="15"/>
               </w:rPr>
               <w:t>4</w:t>
             </w:r>
@@ -6884,15 +6704,14 @@
           </w:tcPr>
           <w:p>
             <w:pPr>
-              <w:spacing w:line="269" w:lineRule="auto" w:before="0" w:after="0"/>
+              <w:spacing w:line="240" w:lineRule="auto" w:before="0" w:after="0"/>
               <w:jc w:val="center"/>
             </w:pPr>
-            <w:r/>
-            <w:r>
-              <w:rPr>
-                <w:rFonts w:ascii="Times New Roman" w:hAnsi="Times New Roman" w:eastAsia="宋体"/>
+            <w:r>
+              <w:rPr>
+                <w:rFonts w:ascii="Times New Roman" w:hAnsi="Times New Roman" w:cs="Times New Roman" w:eastAsia="宋体"/>
                 <w:b w:val="0"/>
-                <w:sz w:val="16"/>
+                <w:sz w:val="15"/>
               </w:rPr>
               <w:t>2</w:t>
             </w:r>
@@ -6911,15 +6730,14 @@
           </w:tcPr>
           <w:p>
             <w:pPr>
-              <w:spacing w:line="269" w:lineRule="auto" w:before="0" w:after="0"/>
+              <w:spacing w:line="240" w:lineRule="auto" w:before="0" w:after="0"/>
               <w:jc w:val="center"/>
             </w:pPr>
-            <w:r/>
-            <w:r>
-              <w:rPr>
-                <w:rFonts w:ascii="Times New Roman" w:hAnsi="Times New Roman" w:eastAsia="宋体"/>
+            <w:r>
+              <w:rPr>
+                <w:rFonts w:ascii="Times New Roman" w:hAnsi="Times New Roman" w:cs="Times New Roman" w:eastAsia="宋体"/>
                 <w:b w:val="0"/>
-                <w:sz w:val="16"/>
+                <w:sz w:val="15"/>
               </w:rPr>
               <w:t>2</w:t>
             </w:r>
@@ -6938,15 +6756,14 @@
           </w:tcPr>
           <w:p>
             <w:pPr>
-              <w:spacing w:line="269" w:lineRule="auto" w:before="0" w:after="0"/>
-              <w:jc w:val="left"/>
-            </w:pPr>
-            <w:r/>
-            <w:r>
-              <w:rPr>
-                <w:rFonts w:ascii="Times New Roman" w:hAnsi="Times New Roman" w:eastAsia="宋体"/>
+              <w:spacing w:line="240" w:lineRule="auto" w:before="0" w:after="0"/>
+              <w:jc w:val="center"/>
+            </w:pPr>
+            <w:r>
+              <w:rPr>
+                <w:rFonts w:ascii="Times New Roman" w:hAnsi="Times New Roman" w:cs="Times New Roman" w:eastAsia="宋体"/>
                 <w:b w:val="0"/>
-                <w:sz w:val="16"/>
+                <w:sz w:val="15"/>
               </w:rPr>
               <w:t>15%</w:t>
             </w:r>
@@ -6965,15 +6782,14 @@
           </w:tcPr>
           <w:p>
             <w:pPr>
-              <w:spacing w:line="269" w:lineRule="auto" w:before="0" w:after="0"/>
-              <w:jc w:val="left"/>
-            </w:pPr>
-            <w:r/>
-            <w:r>
-              <w:rPr>
-                <w:rFonts w:ascii="Times New Roman" w:hAnsi="Times New Roman" w:eastAsia="宋体"/>
+              <w:spacing w:line="240" w:lineRule="auto" w:before="0" w:after="0"/>
+              <w:jc w:val="center"/>
+            </w:pPr>
+            <w:r>
+              <w:rPr>
+                <w:rFonts w:ascii="Times New Roman" w:hAnsi="Times New Roman" w:cs="Times New Roman" w:eastAsia="宋体"/>
                 <w:b w:val="0"/>
-                <w:sz w:val="16"/>
+                <w:sz w:val="15"/>
               </w:rPr>
               <w:t>10%</w:t>
             </w:r>
@@ -6992,42 +6808,14 @@
           </w:tcPr>
           <w:p>
             <w:pPr>
-              <w:spacing w:line="269" w:lineRule="auto" w:before="0" w:after="0"/>
-              <w:jc w:val="left"/>
-            </w:pPr>
-            <w:r/>
-            <w:r>
-              <w:rPr>
-                <w:rFonts w:ascii="Times New Roman" w:hAnsi="Times New Roman" w:eastAsia="宋体"/>
+              <w:spacing w:line="240" w:lineRule="auto" w:before="0" w:after="0"/>
+              <w:jc w:val="center"/>
+            </w:pPr>
+            <w:r>
+              <w:rPr>
+                <w:rFonts w:ascii="Times New Roman" w:hAnsi="Times New Roman" w:cs="Times New Roman" w:eastAsia="宋体"/>
                 <w:b w:val="0"/>
-                <w:sz w:val="16"/>
-              </w:rPr>
-              <w:t>15%</w:t>
-            </w:r>
-          </w:p>
-        </w:tc>
-        <w:tc>
-          <w:tcPr>
-            <w:tcW w:type="dxa" w:w="959"/>
-            <w:vAlign w:val="center"/>
-            <w:tcMar>
-              <w:top w:w="80" w:type="dxa"/>
-              <w:start w:w="70" w:type="dxa"/>
-              <w:bottom w:w="80" w:type="dxa"/>
-              <w:end w:w="70" w:type="dxa"/>
-            </w:tcMar>
-          </w:tcPr>
-          <w:p>
-            <w:pPr>
-              <w:spacing w:line="269" w:lineRule="auto" w:before="0" w:after="0"/>
-              <w:jc w:val="left"/>
-            </w:pPr>
-            <w:r/>
-            <w:r>
-              <w:rPr>
-                <w:rFonts w:ascii="Times New Roman" w:hAnsi="Times New Roman" w:eastAsia="宋体"/>
-                <w:b w:val="0"/>
-                <w:sz w:val="16"/>
+                <w:sz w:val="15"/>
               </w:rPr>
               <w:t>15%</w:t>
             </w:r>
@@ -7046,15 +6834,14 @@
           </w:tcPr>
           <w:p>
             <w:pPr>
-              <w:spacing w:line="269" w:lineRule="auto" w:before="0" w:after="0"/>
-              <w:jc w:val="left"/>
-            </w:pPr>
-            <w:r/>
-            <w:r>
-              <w:rPr>
-                <w:rFonts w:ascii="Times New Roman" w:hAnsi="Times New Roman" w:eastAsia="宋体"/>
+              <w:spacing w:line="240" w:lineRule="auto" w:before="0" w:after="0"/>
+              <w:jc w:val="center"/>
+            </w:pPr>
+            <w:r>
+              <w:rPr>
+                <w:rFonts w:ascii="Times New Roman" w:hAnsi="Times New Roman" w:cs="Times New Roman" w:eastAsia="宋体"/>
                 <w:b w:val="0"/>
-                <w:sz w:val="16"/>
+                <w:sz w:val="15"/>
               </w:rPr>
               <w:t>目标 1.5，2.5，3.5</w:t>
             </w:r>
@@ -7075,15 +6862,14 @@
           </w:tcPr>
           <w:p>
             <w:pPr>
-              <w:spacing w:line="269" w:lineRule="auto" w:before="0" w:after="0"/>
+              <w:spacing w:line="240" w:lineRule="auto" w:before="0" w:after="0"/>
               <w:jc w:val="left"/>
             </w:pPr>
-            <w:r/>
-            <w:r>
-              <w:rPr>
-                <w:rFonts w:ascii="Times New Roman" w:hAnsi="Times New Roman" w:eastAsia="宋体"/>
-                <w:b w:val="0"/>
-                <w:sz w:val="16"/>
+            <w:r>
+              <w:rPr>
+                <w:rFonts w:ascii="Times New Roman" w:hAnsi="Times New Roman" w:cs="Times New Roman" w:eastAsia="宋体"/>
+                <w:b/>
+                <w:sz w:val="15"/>
               </w:rPr>
               <w:t>系统集成、诊断与交付</w:t>
             </w:r>
@@ -7102,15 +6888,14 @@
           </w:tcPr>
           <w:p>
             <w:pPr>
-              <w:spacing w:line="269" w:lineRule="auto" w:before="0" w:after="0"/>
+              <w:spacing w:line="240" w:lineRule="auto" w:before="0" w:after="0"/>
               <w:jc w:val="center"/>
             </w:pPr>
-            <w:r/>
-            <w:r>
-              <w:rPr>
-                <w:rFonts w:ascii="Times New Roman" w:hAnsi="Times New Roman" w:eastAsia="宋体"/>
+            <w:r>
+              <w:rPr>
+                <w:rFonts w:ascii="Times New Roman" w:hAnsi="Times New Roman" w:cs="Times New Roman" w:eastAsia="宋体"/>
                 <w:b w:val="0"/>
-                <w:sz w:val="16"/>
+                <w:sz w:val="15"/>
               </w:rPr>
               <w:t>6</w:t>
             </w:r>
@@ -7129,15 +6914,14 @@
           </w:tcPr>
           <w:p>
             <w:pPr>
-              <w:spacing w:line="269" w:lineRule="auto" w:before="0" w:after="0"/>
+              <w:spacing w:line="240" w:lineRule="auto" w:before="0" w:after="0"/>
               <w:jc w:val="center"/>
             </w:pPr>
-            <w:r/>
-            <w:r>
-              <w:rPr>
-                <w:rFonts w:ascii="Times New Roman" w:hAnsi="Times New Roman" w:eastAsia="宋体"/>
+            <w:r>
+              <w:rPr>
+                <w:rFonts w:ascii="Times New Roman" w:hAnsi="Times New Roman" w:cs="Times New Roman" w:eastAsia="宋体"/>
                 <w:b w:val="0"/>
-                <w:sz w:val="16"/>
+                <w:sz w:val="15"/>
               </w:rPr>
               <w:t>2</w:t>
             </w:r>
@@ -7156,15 +6940,14 @@
           </w:tcPr>
           <w:p>
             <w:pPr>
-              <w:spacing w:line="269" w:lineRule="auto" w:before="0" w:after="0"/>
+              <w:spacing w:line="240" w:lineRule="auto" w:before="0" w:after="0"/>
               <w:jc w:val="center"/>
             </w:pPr>
-            <w:r/>
-            <w:r>
-              <w:rPr>
-                <w:rFonts w:ascii="Times New Roman" w:hAnsi="Times New Roman" w:eastAsia="宋体"/>
+            <w:r>
+              <w:rPr>
+                <w:rFonts w:ascii="Times New Roman" w:hAnsi="Times New Roman" w:cs="Times New Roman" w:eastAsia="宋体"/>
                 <w:b w:val="0"/>
-                <w:sz w:val="16"/>
+                <w:sz w:val="15"/>
               </w:rPr>
               <w:t>4</w:t>
             </w:r>
@@ -7183,15 +6966,14 @@
           </w:tcPr>
           <w:p>
             <w:pPr>
-              <w:spacing w:line="269" w:lineRule="auto" w:before="0" w:after="0"/>
-              <w:jc w:val="left"/>
-            </w:pPr>
-            <w:r/>
-            <w:r>
-              <w:rPr>
-                <w:rFonts w:ascii="Times New Roman" w:hAnsi="Times New Roman" w:eastAsia="宋体"/>
+              <w:spacing w:line="240" w:lineRule="auto" w:before="0" w:after="0"/>
+              <w:jc w:val="center"/>
+            </w:pPr>
+            <w:r>
+              <w:rPr>
+                <w:rFonts w:ascii="Times New Roman" w:hAnsi="Times New Roman" w:cs="Times New Roman" w:eastAsia="宋体"/>
                 <w:b w:val="0"/>
-                <w:sz w:val="16"/>
+                <w:sz w:val="15"/>
               </w:rPr>
               <w:t>20%</w:t>
             </w:r>
@@ -7210,15 +6992,14 @@
           </w:tcPr>
           <w:p>
             <w:pPr>
-              <w:spacing w:line="269" w:lineRule="auto" w:before="0" w:after="0"/>
-              <w:jc w:val="left"/>
-            </w:pPr>
-            <w:r/>
-            <w:r>
-              <w:rPr>
-                <w:rFonts w:ascii="Times New Roman" w:hAnsi="Times New Roman" w:eastAsia="宋体"/>
+              <w:spacing w:line="240" w:lineRule="auto" w:before="0" w:after="0"/>
+              <w:jc w:val="center"/>
+            </w:pPr>
+            <w:r>
+              <w:rPr>
+                <w:rFonts w:ascii="Times New Roman" w:hAnsi="Times New Roman" w:cs="Times New Roman" w:eastAsia="宋体"/>
                 <w:b w:val="0"/>
-                <w:sz w:val="16"/>
+                <w:sz w:val="15"/>
               </w:rPr>
               <w:t>25%</w:t>
             </w:r>
@@ -7237,42 +7018,14 @@
           </w:tcPr>
           <w:p>
             <w:pPr>
-              <w:spacing w:line="269" w:lineRule="auto" w:before="0" w:after="0"/>
-              <w:jc w:val="left"/>
-            </w:pPr>
-            <w:r/>
-            <w:r>
-              <w:rPr>
-                <w:rFonts w:ascii="Times New Roman" w:hAnsi="Times New Roman" w:eastAsia="宋体"/>
+              <w:spacing w:line="240" w:lineRule="auto" w:before="0" w:after="0"/>
+              <w:jc w:val="center"/>
+            </w:pPr>
+            <w:r>
+              <w:rPr>
+                <w:rFonts w:ascii="Times New Roman" w:hAnsi="Times New Roman" w:cs="Times New Roman" w:eastAsia="宋体"/>
                 <w:b w:val="0"/>
-                <w:sz w:val="16"/>
-              </w:rPr>
-              <w:t>20%</w:t>
-            </w:r>
-          </w:p>
-        </w:tc>
-        <w:tc>
-          <w:tcPr>
-            <w:tcW w:type="dxa" w:w="959"/>
-            <w:vAlign w:val="center"/>
-            <w:tcMar>
-              <w:top w:w="80" w:type="dxa"/>
-              <w:start w:w="70" w:type="dxa"/>
-              <w:bottom w:w="80" w:type="dxa"/>
-              <w:end w:w="70" w:type="dxa"/>
-            </w:tcMar>
-          </w:tcPr>
-          <w:p>
-            <w:pPr>
-              <w:spacing w:line="269" w:lineRule="auto" w:before="0" w:after="0"/>
-              <w:jc w:val="left"/>
-            </w:pPr>
-            <w:r/>
-            <w:r>
-              <w:rPr>
-                <w:rFonts w:ascii="Times New Roman" w:hAnsi="Times New Roman" w:eastAsia="宋体"/>
-                <w:b w:val="0"/>
-                <w:sz w:val="16"/>
+                <w:sz w:val="15"/>
               </w:rPr>
               <w:t>20%</w:t>
             </w:r>
@@ -7291,15 +7044,14 @@
           </w:tcPr>
           <w:p>
             <w:pPr>
-              <w:spacing w:line="269" w:lineRule="auto" w:before="0" w:after="0"/>
-              <w:jc w:val="left"/>
-            </w:pPr>
-            <w:r/>
-            <w:r>
-              <w:rPr>
-                <w:rFonts w:ascii="Times New Roman" w:hAnsi="Times New Roman" w:eastAsia="宋体"/>
+              <w:spacing w:line="240" w:lineRule="auto" w:before="0" w:after="0"/>
+              <w:jc w:val="center"/>
+            </w:pPr>
+            <w:r>
+              <w:rPr>
+                <w:rFonts w:ascii="Times New Roman" w:hAnsi="Times New Roman" w:cs="Times New Roman" w:eastAsia="宋体"/>
                 <w:b w:val="0"/>
-                <w:sz w:val="16"/>
+                <w:sz w:val="15"/>
               </w:rPr>
               <w:t>目标 1.6，2.6，3.6</w:t>
             </w:r>
@@ -7320,15 +7072,14 @@
           </w:tcPr>
           <w:p>
             <w:pPr>
-              <w:spacing w:line="269" w:lineRule="auto" w:before="0" w:after="0"/>
+              <w:spacing w:line="240" w:lineRule="auto" w:before="0" w:after="0"/>
               <w:jc w:val="left"/>
             </w:pPr>
-            <w:r/>
-            <w:r>
-              <w:rPr>
-                <w:rFonts w:ascii="Times New Roman" w:hAnsi="Times New Roman" w:eastAsia="宋体"/>
-                <w:b w:val="0"/>
-                <w:sz w:val="16"/>
+            <w:r>
+              <w:rPr>
+                <w:rFonts w:ascii="Times New Roman" w:hAnsi="Times New Roman" w:cs="Times New Roman" w:eastAsia="宋体"/>
+                <w:b/>
+                <w:sz w:val="15"/>
               </w:rPr>
               <w:t>合计</w:t>
             </w:r>
@@ -7347,15 +7098,14 @@
           </w:tcPr>
           <w:p>
             <w:pPr>
-              <w:spacing w:line="269" w:lineRule="auto" w:before="0" w:after="0"/>
+              <w:spacing w:line="240" w:lineRule="auto" w:before="0" w:after="0"/>
               <w:jc w:val="center"/>
             </w:pPr>
-            <w:r/>
-            <w:r>
-              <w:rPr>
-                <w:rFonts w:ascii="Times New Roman" w:hAnsi="Times New Roman" w:eastAsia="宋体"/>
-                <w:b w:val="0"/>
-                <w:sz w:val="16"/>
+            <w:r>
+              <w:rPr>
+                <w:rFonts w:ascii="Times New Roman" w:hAnsi="Times New Roman" w:cs="Times New Roman" w:eastAsia="宋体"/>
+                <w:b/>
+                <w:sz w:val="15"/>
               </w:rPr>
               <w:t>32</w:t>
             </w:r>
@@ -7374,15 +7124,14 @@
           </w:tcPr>
           <w:p>
             <w:pPr>
-              <w:spacing w:line="269" w:lineRule="auto" w:before="0" w:after="0"/>
+              <w:spacing w:line="240" w:lineRule="auto" w:before="0" w:after="0"/>
               <w:jc w:val="center"/>
             </w:pPr>
-            <w:r/>
-            <w:r>
-              <w:rPr>
-                <w:rFonts w:ascii="Times New Roman" w:hAnsi="Times New Roman" w:eastAsia="宋体"/>
-                <w:b w:val="0"/>
-                <w:sz w:val="16"/>
+            <w:r>
+              <w:rPr>
+                <w:rFonts w:ascii="Times New Roman" w:hAnsi="Times New Roman" w:cs="Times New Roman" w:eastAsia="宋体"/>
+                <w:b/>
+                <w:sz w:val="15"/>
               </w:rPr>
               <w:t>16</w:t>
             </w:r>
@@ -7401,15 +7150,14 @@
           </w:tcPr>
           <w:p>
             <w:pPr>
-              <w:spacing w:line="269" w:lineRule="auto" w:before="0" w:after="0"/>
+              <w:spacing w:line="240" w:lineRule="auto" w:before="0" w:after="0"/>
               <w:jc w:val="center"/>
             </w:pPr>
-            <w:r/>
-            <w:r>
-              <w:rPr>
-                <w:rFonts w:ascii="Times New Roman" w:hAnsi="Times New Roman" w:eastAsia="宋体"/>
-                <w:b w:val="0"/>
-                <w:sz w:val="16"/>
+            <w:r>
+              <w:rPr>
+                <w:rFonts w:ascii="Times New Roman" w:hAnsi="Times New Roman" w:cs="Times New Roman" w:eastAsia="宋体"/>
+                <w:b/>
+                <w:sz w:val="15"/>
               </w:rPr>
               <w:t>16</w:t>
             </w:r>
@@ -7428,15 +7176,14 @@
           </w:tcPr>
           <w:p>
             <w:pPr>
-              <w:spacing w:line="269" w:lineRule="auto" w:before="0" w:after="0"/>
-              <w:jc w:val="left"/>
-            </w:pPr>
-            <w:r/>
-            <w:r>
-              <w:rPr>
-                <w:rFonts w:ascii="Times New Roman" w:hAnsi="Times New Roman" w:eastAsia="宋体"/>
-                <w:b w:val="0"/>
-                <w:sz w:val="16"/>
+              <w:spacing w:line="240" w:lineRule="auto" w:before="0" w:after="0"/>
+              <w:jc w:val="center"/>
+            </w:pPr>
+            <w:r>
+              <w:rPr>
+                <w:rFonts w:ascii="Times New Roman" w:hAnsi="Times New Roman" w:cs="Times New Roman" w:eastAsia="宋体"/>
+                <w:b/>
+                <w:sz w:val="15"/>
               </w:rPr>
               <w:t>100%</w:t>
             </w:r>
@@ -7455,15 +7202,14 @@
           </w:tcPr>
           <w:p>
             <w:pPr>
-              <w:spacing w:line="269" w:lineRule="auto" w:before="0" w:after="0"/>
-              <w:jc w:val="left"/>
-            </w:pPr>
-            <w:r/>
-            <w:r>
-              <w:rPr>
-                <w:rFonts w:ascii="Times New Roman" w:hAnsi="Times New Roman" w:eastAsia="宋体"/>
-                <w:b w:val="0"/>
-                <w:sz w:val="16"/>
+              <w:spacing w:line="240" w:lineRule="auto" w:before="0" w:after="0"/>
+              <w:jc w:val="center"/>
+            </w:pPr>
+            <w:r>
+              <w:rPr>
+                <w:rFonts w:ascii="Times New Roman" w:hAnsi="Times New Roman" w:cs="Times New Roman" w:eastAsia="宋体"/>
+                <w:b/>
+                <w:sz w:val="15"/>
               </w:rPr>
               <w:t>100%</w:t>
             </w:r>
@@ -7482,42 +7228,14 @@
           </w:tcPr>
           <w:p>
             <w:pPr>
-              <w:spacing w:line="269" w:lineRule="auto" w:before="0" w:after="0"/>
-              <w:jc w:val="left"/>
-            </w:pPr>
-            <w:r/>
-            <w:r>
-              <w:rPr>
-                <w:rFonts w:ascii="Times New Roman" w:hAnsi="Times New Roman" w:eastAsia="宋体"/>
-                <w:b w:val="0"/>
-                <w:sz w:val="16"/>
-              </w:rPr>
-              <w:t>100%</w:t>
-            </w:r>
-          </w:p>
-        </w:tc>
-        <w:tc>
-          <w:tcPr>
-            <w:tcW w:type="dxa" w:w="959"/>
-            <w:vAlign w:val="center"/>
-            <w:tcMar>
-              <w:top w:w="80" w:type="dxa"/>
-              <w:start w:w="70" w:type="dxa"/>
-              <w:bottom w:w="80" w:type="dxa"/>
-              <w:end w:w="70" w:type="dxa"/>
-            </w:tcMar>
-          </w:tcPr>
-          <w:p>
-            <w:pPr>
-              <w:spacing w:line="269" w:lineRule="auto" w:before="0" w:after="0"/>
-              <w:jc w:val="left"/>
-            </w:pPr>
-            <w:r/>
-            <w:r>
-              <w:rPr>
-                <w:rFonts w:ascii="Times New Roman" w:hAnsi="Times New Roman" w:eastAsia="宋体"/>
-                <w:b w:val="0"/>
-                <w:sz w:val="16"/>
+              <w:spacing w:line="240" w:lineRule="auto" w:before="0" w:after="0"/>
+              <w:jc w:val="center"/>
+            </w:pPr>
+            <w:r>
+              <w:rPr>
+                <w:rFonts w:ascii="Times New Roman" w:hAnsi="Times New Roman" w:cs="Times New Roman" w:eastAsia="宋体"/>
+                <w:b/>
+                <w:sz w:val="15"/>
               </w:rPr>
               <w:t>100%</w:t>
             </w:r>
@@ -7536,15 +7254,14 @@
           </w:tcPr>
           <w:p>
             <w:pPr>
-              <w:spacing w:line="269" w:lineRule="auto" w:before="0" w:after="0"/>
-              <w:jc w:val="left"/>
-            </w:pPr>
-            <w:r/>
-            <w:r>
-              <w:rPr>
-                <w:rFonts w:ascii="Times New Roman" w:hAnsi="Times New Roman" w:eastAsia="宋体"/>
-                <w:b w:val="0"/>
-                <w:sz w:val="16"/>
+              <w:spacing w:line="240" w:lineRule="auto" w:before="0" w:after="0"/>
+              <w:jc w:val="center"/>
+            </w:pPr>
+            <w:r>
+              <w:rPr>
+                <w:rFonts w:ascii="Times New Roman" w:hAnsi="Times New Roman" w:cs="Times New Roman" w:eastAsia="宋体"/>
+                <w:b/>
+                <w:sz w:val="15"/>
               </w:rPr>
               <w:t>全部课程目标</w:t>
             </w:r>
@@ -7582,17 +7299,15 @@
     </w:p>
     <w:p>
       <w:pPr>
-        <w:spacing w:line="283" w:lineRule="auto" w:before="0" w:after="20"/>
+        <w:spacing w:line="283" w:lineRule="auto" w:before="0" w:after="0"/>
         <w:ind w:firstLine="420"/>
         <w:jc w:val="left"/>
       </w:pPr>
       <w:r>
         <w:rPr>
-          <w:rFonts w:ascii="Times New Roman" w:hAnsi="Times New Roman" w:eastAsia="宋体"/>
-          <w:b w:val="0"/>
-          <w:sz w:val="21"/>
+          <w:rFonts w:ascii="Times New Roman" w:hAnsi="Times New Roman" w:cs="Times New Roman" w:eastAsia="宋体"/>
         </w:rPr>
-        <w:t>考查。</w:t>
+        <w:t>考查（期末采用综合考查，不安排期末笔试或机考）。</w:t>
       </w:r>
     </w:p>
     <w:p>
@@ -7611,17 +7326,15 @@
     </w:p>
     <w:p>
       <w:pPr>
-        <w:spacing w:line="283" w:lineRule="auto" w:before="0" w:after="20"/>
+        <w:spacing w:line="283" w:lineRule="auto" w:before="0" w:after="0"/>
         <w:ind w:firstLine="420"/>
         <w:jc w:val="left"/>
       </w:pPr>
       <w:r>
         <w:rPr>
-          <w:rFonts w:ascii="Times New Roman" w:hAnsi="Times New Roman" w:eastAsia="宋体"/>
-          <w:b w:val="0"/>
-          <w:sz w:val="21"/>
+          <w:rFonts w:ascii="Times New Roman" w:hAnsi="Times New Roman" w:cs="Times New Roman" w:eastAsia="宋体"/>
         </w:rPr>
-        <w:t>各项按百分制评分。总评成绩=平时学习与过程记录×15%＋上机任务×35%＋综合设计成果×40%＋个人核验与答辩×10%。综合任务为“物料输送分拣单元PLC控制与监控”，可由2—3人协作，但个人须能够解释和修改本人负责模块。上机成绩评价分阶段的实现与验证，综合成果评价最终一致性、故障处理与工程交付，个人核验评价独立掌握情况，不重复按同一份演示直接给分。</w:t>
+        <w:t>各项按百分制评分。总评成绩=平时成绩×20%＋课程作业×20%＋期末综合考查×60%。平时成绩主要评价课堂任务参与、原理理解、过程记录、工程规范和安全学习责任。课程作业以四次上机任务为主要载体，重点评价PLC工程组态、数字量控制、顺序控制、模拟量/HMI/接口以及联调诊断过程中的阶段性实现、测试和调试证据。期末综合考查由综合设计成果和个人核验答辩共同组成，其中综合设计成果占期末综合考查的80%，个人核验答辩占期末综合考查的20%。综合设计成果继续采用“物料输送分拣单元PLC控制与监控”作为综合载体；个人核验答辩通过原理解释、现场修改与排错、资料依据和个人贡献核验独立掌握情况。综合成果在四次上机任务中递进形成，不另增实验或项目式教学学时。</w:t>
       </w:r>
     </w:p>
     <w:p>
@@ -7671,15 +7384,13 @@
     <w:p>
       <w:pPr>
         <w:keepNext/>
-        <w:spacing w:line="283" w:lineRule="auto" w:before="60" w:after="20"/>
+        <w:spacing w:line="283" w:lineRule="auto" w:before="0" w:after="0"/>
       </w:pPr>
       <w:r>
         <w:rPr>
-          <w:rFonts w:ascii="Times New Roman" w:hAnsi="Times New Roman" w:eastAsia="宋体"/>
-          <w:b/>
-          <w:sz w:val="21"/>
+          <w:rFonts w:ascii="Times New Roman" w:hAnsi="Times New Roman" w:cs="Times New Roman" w:eastAsia="宋体"/>
         </w:rPr>
-        <w:t>（1）平时学习与过程记录评分标准</w:t>
+        <w:t>（1）平时成绩评分标准</w:t>
       </w:r>
     </w:p>
     <w:tbl>
@@ -8245,30 +7956,28 @@
     <w:p>
       <w:pPr>
         <w:keepNext/>
-        <w:spacing w:line="283" w:lineRule="auto" w:before="60" w:after="20"/>
+        <w:spacing w:line="283" w:lineRule="auto" w:before="0" w:after="0"/>
       </w:pPr>
       <w:r>
         <w:rPr>
-          <w:rFonts w:ascii="Times New Roman" w:hAnsi="Times New Roman" w:eastAsia="宋体"/>
-          <w:b/>
-          <w:sz w:val="21"/>
+          <w:rFonts w:ascii="Times New Roman" w:hAnsi="Times New Roman" w:cs="Times New Roman" w:eastAsia="宋体"/>
         </w:rPr>
-        <w:t>（2）上机任务评分标准</w:t>
+        <w:t>（2）课程作业评分标准</w:t>
       </w:r>
     </w:p>
     <w:p>
       <w:pPr>
-        <w:spacing w:line="283" w:lineRule="auto" w:before="0" w:after="20"/>
+        <w:spacing w:line="264" w:lineRule="auto" w:before="0" w:after="0"/>
         <w:ind w:firstLine="420"/>
         <w:jc w:val="left"/>
       </w:pPr>
       <w:r>
         <w:rPr>
-          <w:rFonts w:ascii="Times New Roman" w:hAnsi="Times New Roman" w:eastAsia="宋体"/>
+          <w:rFonts w:ascii="Times New Roman" w:hAnsi="Times New Roman" w:cs="Times New Roman" w:eastAsia="宋体"/>
           <w:b w:val="0"/>
-          <w:sz w:val="21"/>
+          <w:sz w:val="19"/>
         </w:rPr>
-        <w:t>四次上机各占上机成绩25%。每次任务内部按功能正确性45%、边界与安全逻辑20%、测试和调试证据25%、工程规范10%评分。上机一分配到第一、二单元的内容权重分别为10%、15%；上机二对应第三单元25%；上机三对应第四、五单元15%、10%；上机四对应第六单元25%，与上表一致。</w:t>
+        <w:t>四次上机任务各占课程作业成绩25%。每次任务内部按功能正确性45%、边界与安全逻辑20%、测试和调试证据25%、工程规范10%评分。</w:t>
       </w:r>
     </w:p>
     <w:tbl>
@@ -8310,17 +8019,16 @@
           </w:tcPr>
           <w:p>
             <w:pPr>
-              <w:spacing w:line="269" w:lineRule="auto" w:before="0" w:after="0"/>
+              <w:spacing w:line="240" w:lineRule="auto" w:before="0" w:after="0"/>
               <w:jc w:val="center"/>
             </w:pPr>
-            <w:r/>
-            <w:r>
-              <w:rPr>
-                <w:rFonts w:ascii="Times New Roman" w:hAnsi="Times New Roman" w:eastAsia="宋体"/>
+            <w:r>
+              <w:rPr>
+                <w:rFonts w:ascii="Times New Roman" w:hAnsi="Times New Roman" w:cs="Times New Roman" w:eastAsia="宋体"/>
                 <w:b/>
-                <w:sz w:val="17"/>
-              </w:rPr>
-              <w:t>上机任务</w:t>
+                <w:sz w:val="16"/>
+              </w:rPr>
+              <w:t>课程作业</w:t>
             </w:r>
           </w:p>
         </w:tc>
@@ -8944,15 +8652,13 @@
     <w:p>
       <w:pPr>
         <w:keepNext/>
-        <w:spacing w:line="283" w:lineRule="auto" w:before="60" w:after="20"/>
+        <w:spacing w:line="283" w:lineRule="auto" w:before="0" w:after="0"/>
       </w:pPr>
       <w:r>
         <w:rPr>
-          <w:rFonts w:ascii="Times New Roman" w:hAnsi="Times New Roman" w:eastAsia="宋体"/>
-          <w:b/>
-          <w:sz w:val="21"/>
+          <w:rFonts w:ascii="Times New Roman" w:hAnsi="Times New Roman" w:cs="Times New Roman" w:eastAsia="宋体"/>
         </w:rPr>
-        <w:t>（3）综合设计成果评分标准</w:t>
+        <w:t>（3）期末综合考查评分标准</w:t>
       </w:r>
     </w:p>
     <w:tbl>
@@ -8994,15 +8700,14 @@
           </w:tcPr>
           <w:p>
             <w:pPr>
-              <w:spacing w:line="269" w:lineRule="auto" w:before="0" w:after="0"/>
+              <w:spacing w:line="240" w:lineRule="auto" w:before="0" w:after="0"/>
               <w:jc w:val="center"/>
             </w:pPr>
-            <w:r/>
-            <w:r>
-              <w:rPr>
-                <w:rFonts w:ascii="Times New Roman" w:hAnsi="Times New Roman" w:eastAsia="宋体"/>
+            <w:r>
+              <w:rPr>
+                <w:rFonts w:ascii="Times New Roman" w:hAnsi="Times New Roman" w:cs="Times New Roman" w:eastAsia="宋体"/>
                 <w:b/>
-                <w:sz w:val="17"/>
+                <w:sz w:val="16"/>
               </w:rPr>
               <w:t>考核内容</w:t>
             </w:r>
@@ -9021,15 +8726,14 @@
           </w:tcPr>
           <w:p>
             <w:pPr>
-              <w:spacing w:line="269" w:lineRule="auto" w:before="0" w:after="0"/>
+              <w:spacing w:line="240" w:lineRule="auto" w:before="0" w:after="0"/>
               <w:jc w:val="center"/>
             </w:pPr>
-            <w:r/>
-            <w:r>
-              <w:rPr>
-                <w:rFonts w:ascii="Times New Roman" w:hAnsi="Times New Roman" w:eastAsia="宋体"/>
+            <w:r>
+              <w:rPr>
+                <w:rFonts w:ascii="Times New Roman" w:hAnsi="Times New Roman" w:cs="Times New Roman" w:eastAsia="宋体"/>
                 <w:b/>
-                <w:sz w:val="17"/>
+                <w:sz w:val="16"/>
               </w:rPr>
               <w:t>成绩占比</w:t>
             </w:r>
@@ -9048,15 +8752,14 @@
           </w:tcPr>
           <w:p>
             <w:pPr>
-              <w:spacing w:line="269" w:lineRule="auto" w:before="0" w:after="0"/>
+              <w:spacing w:line="240" w:lineRule="auto" w:before="0" w:after="0"/>
               <w:jc w:val="center"/>
             </w:pPr>
-            <w:r/>
-            <w:r>
-              <w:rPr>
-                <w:rFonts w:ascii="Times New Roman" w:hAnsi="Times New Roman" w:eastAsia="宋体"/>
+            <w:r>
+              <w:rPr>
+                <w:rFonts w:ascii="Times New Roman" w:hAnsi="Times New Roman" w:cs="Times New Roman" w:eastAsia="宋体"/>
                 <w:b/>
-                <w:sz w:val="17"/>
+                <w:sz w:val="16"/>
               </w:rPr>
               <w:t>评分要求</w:t>
             </w:r>
@@ -9075,15 +8778,14 @@
           </w:tcPr>
           <w:p>
             <w:pPr>
-              <w:spacing w:line="269" w:lineRule="auto" w:before="0" w:after="0"/>
+              <w:spacing w:line="240" w:lineRule="auto" w:before="0" w:after="0"/>
               <w:jc w:val="center"/>
             </w:pPr>
-            <w:r/>
-            <w:r>
-              <w:rPr>
-                <w:rFonts w:ascii="Times New Roman" w:hAnsi="Times New Roman" w:eastAsia="宋体"/>
+            <w:r>
+              <w:rPr>
+                <w:rFonts w:ascii="Times New Roman" w:hAnsi="Times New Roman" w:cs="Times New Roman" w:eastAsia="宋体"/>
                 <w:b/>
-                <w:sz w:val="17"/>
+                <w:sz w:val="16"/>
               </w:rPr>
               <w:t>课程目标</w:t>
             </w:r>
@@ -9104,15 +8806,14 @@
           </w:tcPr>
           <w:p>
             <w:pPr>
-              <w:spacing w:line="269" w:lineRule="auto" w:before="0" w:after="0"/>
-              <w:jc w:val="left"/>
-            </w:pPr>
-            <w:r/>
-            <w:r>
-              <w:rPr>
-                <w:rFonts w:ascii="Times New Roman" w:hAnsi="Times New Roman" w:eastAsia="宋体"/>
-                <w:b w:val="0"/>
-                <w:sz w:val="17"/>
+              <w:spacing w:line="240" w:lineRule="auto" w:before="0" w:after="0"/>
+              <w:jc w:val="center"/>
+            </w:pPr>
+            <w:r>
+              <w:rPr>
+                <w:rFonts w:ascii="Times New Roman" w:hAnsi="Times New Roman" w:cs="Times New Roman" w:eastAsia="宋体"/>
+                <w:b/>
+                <w:sz w:val="15"/>
               </w:rPr>
               <w:t>需求、I/O与安全边界</w:t>
             </w:r>
@@ -9131,17 +8832,16 @@
           </w:tcPr>
           <w:p>
             <w:pPr>
-              <w:spacing w:line="269" w:lineRule="auto" w:before="0" w:after="0"/>
+              <w:spacing w:line="240" w:lineRule="auto" w:before="0" w:after="0"/>
               <w:jc w:val="center"/>
             </w:pPr>
-            <w:r/>
-            <w:r>
-              <w:rPr>
-                <w:rFonts w:ascii="Times New Roman" w:hAnsi="Times New Roman" w:eastAsia="宋体"/>
+            <w:r>
+              <w:rPr>
+                <w:rFonts w:ascii="Times New Roman" w:hAnsi="Times New Roman" w:cs="Times New Roman" w:eastAsia="宋体"/>
                 <w:b w:val="0"/>
-                <w:sz w:val="17"/>
-              </w:rPr>
-              <w:t>10%</w:t>
+                <w:sz w:val="15"/>
+              </w:rPr>
+              <w:t>8%</w:t>
             </w:r>
           </w:p>
         </w:tc>
@@ -9158,15 +8858,14 @@
           </w:tcPr>
           <w:p>
             <w:pPr>
-              <w:spacing w:line="269" w:lineRule="auto" w:before="0" w:after="0"/>
+              <w:spacing w:line="240" w:lineRule="auto" w:before="0" w:after="0"/>
               <w:jc w:val="left"/>
             </w:pPr>
-            <w:r/>
-            <w:r>
-              <w:rPr>
-                <w:rFonts w:ascii="Times New Roman" w:hAnsi="Times New Roman" w:eastAsia="宋体"/>
+            <w:r>
+              <w:rPr>
+                <w:rFonts w:ascii="Times New Roman" w:hAnsi="Times New Roman" w:cs="Times New Roman" w:eastAsia="宋体"/>
                 <w:b w:val="0"/>
-                <w:sz w:val="17"/>
+                <w:sz w:val="15"/>
               </w:rPr>
               <w:t>任务、I/O、设备边界和启动允许条件完整；说明普通控制与独立安全保护的区别。</w:t>
             </w:r>
@@ -9185,15 +8884,14 @@
           </w:tcPr>
           <w:p>
             <w:pPr>
-              <w:spacing w:line="269" w:lineRule="auto" w:before="0" w:after="0"/>
-              <w:jc w:val="left"/>
-            </w:pPr>
-            <w:r/>
-            <w:r>
-              <w:rPr>
-                <w:rFonts w:ascii="Times New Roman" w:hAnsi="Times New Roman" w:eastAsia="宋体"/>
+              <w:spacing w:line="240" w:lineRule="auto" w:before="0" w:after="0"/>
+              <w:jc w:val="center"/>
+            </w:pPr>
+            <w:r>
+              <w:rPr>
+                <w:rFonts w:ascii="Times New Roman" w:hAnsi="Times New Roman" w:cs="Times New Roman" w:eastAsia="宋体"/>
                 <w:b w:val="0"/>
-                <w:sz w:val="17"/>
+                <w:sz w:val="15"/>
               </w:rPr>
               <w:t>目标 1.1，2.1，3.1</w:t>
             </w:r>
@@ -9214,15 +8912,14 @@
           </w:tcPr>
           <w:p>
             <w:pPr>
-              <w:spacing w:line="269" w:lineRule="auto" w:before="0" w:after="0"/>
-              <w:jc w:val="left"/>
-            </w:pPr>
-            <w:r/>
-            <w:r>
-              <w:rPr>
-                <w:rFonts w:ascii="Times New Roman" w:hAnsi="Times New Roman" w:eastAsia="宋体"/>
-                <w:b w:val="0"/>
-                <w:sz w:val="17"/>
+              <w:spacing w:line="240" w:lineRule="auto" w:before="0" w:after="0"/>
+              <w:jc w:val="center"/>
+            </w:pPr>
+            <w:r>
+              <w:rPr>
+                <w:rFonts w:ascii="Times New Roman" w:hAnsi="Times New Roman" w:cs="Times New Roman" w:eastAsia="宋体"/>
+                <w:b/>
+                <w:sz w:val="15"/>
               </w:rPr>
               <w:t>数字量功能正确性</w:t>
             </w:r>
@@ -9241,17 +8938,16 @@
           </w:tcPr>
           <w:p>
             <w:pPr>
-              <w:spacing w:line="269" w:lineRule="auto" w:before="0" w:after="0"/>
+              <w:spacing w:line="240" w:lineRule="auto" w:before="0" w:after="0"/>
               <w:jc w:val="center"/>
             </w:pPr>
-            <w:r/>
-            <w:r>
-              <w:rPr>
-                <w:rFonts w:ascii="Times New Roman" w:hAnsi="Times New Roman" w:eastAsia="宋体"/>
+            <w:r>
+              <w:rPr>
+                <w:rFonts w:ascii="Times New Roman" w:hAnsi="Times New Roman" w:cs="Times New Roman" w:eastAsia="宋体"/>
                 <w:b w:val="0"/>
-                <w:sz w:val="17"/>
-              </w:rPr>
-              <w:t>20%</w:t>
+                <w:sz w:val="15"/>
+              </w:rPr>
+              <w:t>16%</w:t>
             </w:r>
           </w:p>
         </w:tc>
@@ -9268,15 +8964,14 @@
           </w:tcPr>
           <w:p>
             <w:pPr>
-              <w:spacing w:line="269" w:lineRule="auto" w:before="0" w:after="0"/>
+              <w:spacing w:line="240" w:lineRule="auto" w:before="0" w:after="0"/>
               <w:jc w:val="left"/>
             </w:pPr>
-            <w:r/>
-            <w:r>
-              <w:rPr>
-                <w:rFonts w:ascii="Times New Roman" w:hAnsi="Times New Roman" w:eastAsia="宋体"/>
+            <w:r>
+              <w:rPr>
+                <w:rFonts w:ascii="Times New Roman" w:hAnsi="Times New Roman" w:cs="Times New Roman" w:eastAsia="宋体"/>
                 <w:b w:val="0"/>
-                <w:sz w:val="17"/>
+                <w:sz w:val="15"/>
               </w:rPr>
               <w:t>启停、互锁、延时与计数满足需求；重复命令、停止及复位优先级经过验证。</w:t>
             </w:r>
@@ -9295,15 +8990,14 @@
           </w:tcPr>
           <w:p>
             <w:pPr>
-              <w:spacing w:line="269" w:lineRule="auto" w:before="0" w:after="0"/>
-              <w:jc w:val="left"/>
-            </w:pPr>
-            <w:r/>
-            <w:r>
-              <w:rPr>
-                <w:rFonts w:ascii="Times New Roman" w:hAnsi="Times New Roman" w:eastAsia="宋体"/>
+              <w:spacing w:line="240" w:lineRule="auto" w:before="0" w:after="0"/>
+              <w:jc w:val="center"/>
+            </w:pPr>
+            <w:r>
+              <w:rPr>
+                <w:rFonts w:ascii="Times New Roman" w:hAnsi="Times New Roman" w:cs="Times New Roman" w:eastAsia="宋体"/>
                 <w:b w:val="0"/>
-                <w:sz w:val="17"/>
+                <w:sz w:val="15"/>
               </w:rPr>
               <w:t>目标 1.2，2.2，3.2</w:t>
             </w:r>
@@ -9324,15 +9018,14 @@
           </w:tcPr>
           <w:p>
             <w:pPr>
-              <w:spacing w:line="269" w:lineRule="auto" w:before="0" w:after="0"/>
-              <w:jc w:val="left"/>
-            </w:pPr>
-            <w:r/>
-            <w:r>
-              <w:rPr>
-                <w:rFonts w:ascii="Times New Roman" w:hAnsi="Times New Roman" w:eastAsia="宋体"/>
-                <w:b w:val="0"/>
-                <w:sz w:val="17"/>
+              <w:spacing w:line="240" w:lineRule="auto" w:before="0" w:after="0"/>
+              <w:jc w:val="center"/>
+            </w:pPr>
+            <w:r>
+              <w:rPr>
+                <w:rFonts w:ascii="Times New Roman" w:hAnsi="Times New Roman" w:cs="Times New Roman" w:eastAsia="宋体"/>
+                <w:b/>
+                <w:sz w:val="15"/>
               </w:rPr>
               <w:t>顺序与模块设计</w:t>
             </w:r>
@@ -9351,17 +9044,16 @@
           </w:tcPr>
           <w:p>
             <w:pPr>
-              <w:spacing w:line="269" w:lineRule="auto" w:before="0" w:after="0"/>
+              <w:spacing w:line="240" w:lineRule="auto" w:before="0" w:after="0"/>
               <w:jc w:val="center"/>
             </w:pPr>
-            <w:r/>
-            <w:r>
-              <w:rPr>
-                <w:rFonts w:ascii="Times New Roman" w:hAnsi="Times New Roman" w:eastAsia="宋体"/>
+            <w:r>
+              <w:rPr>
+                <w:rFonts w:ascii="Times New Roman" w:hAnsi="Times New Roman" w:cs="Times New Roman" w:eastAsia="宋体"/>
                 <w:b w:val="0"/>
-                <w:sz w:val="17"/>
-              </w:rPr>
-              <w:t>20%</w:t>
+                <w:sz w:val="15"/>
+              </w:rPr>
+              <w:t>16%</w:t>
             </w:r>
           </w:p>
         </w:tc>
@@ -9378,15 +9070,14 @@
           </w:tcPr>
           <w:p>
             <w:pPr>
-              <w:spacing w:line="269" w:lineRule="auto" w:before="0" w:after="0"/>
+              <w:spacing w:line="240" w:lineRule="auto" w:before="0" w:after="0"/>
               <w:jc w:val="left"/>
             </w:pPr>
-            <w:r/>
-            <w:r>
-              <w:rPr>
-                <w:rFonts w:ascii="Times New Roman" w:hAnsi="Times New Roman" w:eastAsia="宋体"/>
+            <w:r>
+              <w:rPr>
+                <w:rFonts w:ascii="Times New Roman" w:hAnsi="Times New Roman" w:cs="Times New Roman" w:eastAsia="宋体"/>
                 <w:b w:val="0"/>
-                <w:sz w:val="17"/>
+                <w:sz w:val="15"/>
               </w:rPr>
               <w:t>状态转换清楚，FC/FB/DB职责明确；模式切换、超时和故障复位不产生不受控动作。</w:t>
             </w:r>
@@ -9405,15 +9096,14 @@
           </w:tcPr>
           <w:p>
             <w:pPr>
-              <w:spacing w:line="269" w:lineRule="auto" w:before="0" w:after="0"/>
-              <w:jc w:val="left"/>
-            </w:pPr>
-            <w:r/>
-            <w:r>
-              <w:rPr>
-                <w:rFonts w:ascii="Times New Roman" w:hAnsi="Times New Roman" w:eastAsia="宋体"/>
+              <w:spacing w:line="240" w:lineRule="auto" w:before="0" w:after="0"/>
+              <w:jc w:val="center"/>
+            </w:pPr>
+            <w:r>
+              <w:rPr>
+                <w:rFonts w:ascii="Times New Roman" w:hAnsi="Times New Roman" w:cs="Times New Roman" w:eastAsia="宋体"/>
                 <w:b w:val="0"/>
-                <w:sz w:val="17"/>
+                <w:sz w:val="15"/>
               </w:rPr>
               <w:t>目标 1.3，2.3，3.3</w:t>
             </w:r>
@@ -9434,15 +9124,14 @@
           </w:tcPr>
           <w:p>
             <w:pPr>
-              <w:spacing w:line="269" w:lineRule="auto" w:before="0" w:after="0"/>
-              <w:jc w:val="left"/>
-            </w:pPr>
-            <w:r/>
-            <w:r>
-              <w:rPr>
-                <w:rFonts w:ascii="Times New Roman" w:hAnsi="Times New Roman" w:eastAsia="宋体"/>
-                <w:b w:val="0"/>
-                <w:sz w:val="17"/>
+              <w:spacing w:line="240" w:lineRule="auto" w:before="0" w:after="0"/>
+              <w:jc w:val="center"/>
+            </w:pPr>
+            <w:r>
+              <w:rPr>
+                <w:rFonts w:ascii="Times New Roman" w:hAnsi="Times New Roman" w:cs="Times New Roman" w:eastAsia="宋体"/>
+                <w:b/>
+                <w:sz w:val="15"/>
               </w:rPr>
               <w:t>模拟量处理与证据</w:t>
             </w:r>
@@ -9461,17 +9150,16 @@
           </w:tcPr>
           <w:p>
             <w:pPr>
-              <w:spacing w:line="269" w:lineRule="auto" w:before="0" w:after="0"/>
+              <w:spacing w:line="240" w:lineRule="auto" w:before="0" w:after="0"/>
               <w:jc w:val="center"/>
             </w:pPr>
-            <w:r/>
-            <w:r>
-              <w:rPr>
-                <w:rFonts w:ascii="Times New Roman" w:hAnsi="Times New Roman" w:eastAsia="宋体"/>
+            <w:r>
+              <w:rPr>
+                <w:rFonts w:ascii="Times New Roman" w:hAnsi="Times New Roman" w:cs="Times New Roman" w:eastAsia="宋体"/>
                 <w:b w:val="0"/>
-                <w:sz w:val="17"/>
-              </w:rPr>
-              <w:t>15%</w:t>
+                <w:sz w:val="15"/>
+              </w:rPr>
+              <w:t>12%</w:t>
             </w:r>
           </w:p>
         </w:tc>
@@ -9488,15 +9176,14 @@
           </w:tcPr>
           <w:p>
             <w:pPr>
-              <w:spacing w:line="269" w:lineRule="auto" w:before="0" w:after="0"/>
+              <w:spacing w:line="240" w:lineRule="auto" w:before="0" w:after="0"/>
               <w:jc w:val="left"/>
             </w:pPr>
-            <w:r/>
-            <w:r>
-              <w:rPr>
-                <w:rFonts w:ascii="Times New Roman" w:hAnsi="Times New Roman" w:eastAsia="宋体"/>
+            <w:r>
+              <w:rPr>
+                <w:rFonts w:ascii="Times New Roman" w:hAnsi="Times New Roman" w:cs="Times New Roman" w:eastAsia="宋体"/>
                 <w:b w:val="0"/>
-                <w:sz w:val="17"/>
+                <w:sz w:val="15"/>
               </w:rPr>
               <w:t>量程、单位、标度、回差和越界处理正确，趋势和输入输出记录支持结论。</w:t>
             </w:r>
@@ -9515,15 +9202,14 @@
           </w:tcPr>
           <w:p>
             <w:pPr>
-              <w:spacing w:line="269" w:lineRule="auto" w:before="0" w:after="0"/>
-              <w:jc w:val="left"/>
-            </w:pPr>
-            <w:r/>
-            <w:r>
-              <w:rPr>
-                <w:rFonts w:ascii="Times New Roman" w:hAnsi="Times New Roman" w:eastAsia="宋体"/>
+              <w:spacing w:line="240" w:lineRule="auto" w:before="0" w:after="0"/>
+              <w:jc w:val="center"/>
+            </w:pPr>
+            <w:r>
+              <w:rPr>
+                <w:rFonts w:ascii="Times New Roman" w:hAnsi="Times New Roman" w:cs="Times New Roman" w:eastAsia="宋体"/>
                 <w:b w:val="0"/>
-                <w:sz w:val="17"/>
+                <w:sz w:val="15"/>
               </w:rPr>
               <w:t>目标 1.4，2.4，3.4</w:t>
             </w:r>
@@ -9544,15 +9230,14 @@
           </w:tcPr>
           <w:p>
             <w:pPr>
-              <w:spacing w:line="269" w:lineRule="auto" w:before="0" w:after="0"/>
-              <w:jc w:val="left"/>
-            </w:pPr>
-            <w:r/>
-            <w:r>
-              <w:rPr>
-                <w:rFonts w:ascii="Times New Roman" w:hAnsi="Times New Roman" w:eastAsia="宋体"/>
-                <w:b w:val="0"/>
-                <w:sz w:val="17"/>
+              <w:spacing w:line="240" w:lineRule="auto" w:before="0" w:after="0"/>
+              <w:jc w:val="center"/>
+            </w:pPr>
+            <w:r>
+              <w:rPr>
+                <w:rFonts w:ascii="Times New Roman" w:hAnsi="Times New Roman" w:cs="Times New Roman" w:eastAsia="宋体"/>
+                <w:b/>
+                <w:sz w:val="15"/>
               </w:rPr>
               <w:t>HMI与接口语义</w:t>
             </w:r>
@@ -9571,17 +9256,16 @@
           </w:tcPr>
           <w:p>
             <w:pPr>
-              <w:spacing w:line="269" w:lineRule="auto" w:before="0" w:after="0"/>
+              <w:spacing w:line="240" w:lineRule="auto" w:before="0" w:after="0"/>
               <w:jc w:val="center"/>
             </w:pPr>
-            <w:r/>
-            <w:r>
-              <w:rPr>
-                <w:rFonts w:ascii="Times New Roman" w:hAnsi="Times New Roman" w:eastAsia="宋体"/>
+            <w:r>
+              <w:rPr>
+                <w:rFonts w:ascii="Times New Roman" w:hAnsi="Times New Roman" w:cs="Times New Roman" w:eastAsia="宋体"/>
                 <w:b w:val="0"/>
-                <w:sz w:val="17"/>
-              </w:rPr>
-              <w:t>15%</w:t>
+                <w:sz w:val="15"/>
+              </w:rPr>
+              <w:t>12%</w:t>
             </w:r>
           </w:p>
         </w:tc>
@@ -9598,15 +9282,14 @@
           </w:tcPr>
           <w:p>
             <w:pPr>
-              <w:spacing w:line="269" w:lineRule="auto" w:before="0" w:after="0"/>
+              <w:spacing w:line="240" w:lineRule="auto" w:before="0" w:after="0"/>
               <w:jc w:val="left"/>
             </w:pPr>
-            <w:r/>
-            <w:r>
-              <w:rPr>
-                <w:rFonts w:ascii="Times New Roman" w:hAnsi="Times New Roman" w:eastAsia="宋体"/>
+            <w:r>
+              <w:rPr>
+                <w:rFonts w:ascii="Times New Roman" w:hAnsi="Times New Roman" w:cs="Times New Roman" w:eastAsia="宋体"/>
                 <w:b w:val="0"/>
-                <w:sz w:val="17"/>
+                <w:sz w:val="15"/>
               </w:rPr>
               <w:t>命令、状态、参数、报警关联准确；数据点表、权限和超时处理清楚，说明模拟范围。</w:t>
             </w:r>
@@ -9625,15 +9308,14 @@
           </w:tcPr>
           <w:p>
             <w:pPr>
-              <w:spacing w:line="269" w:lineRule="auto" w:before="0" w:after="0"/>
-              <w:jc w:val="left"/>
-            </w:pPr>
-            <w:r/>
-            <w:r>
-              <w:rPr>
-                <w:rFonts w:ascii="Times New Roman" w:hAnsi="Times New Roman" w:eastAsia="宋体"/>
+              <w:spacing w:line="240" w:lineRule="auto" w:before="0" w:after="0"/>
+              <w:jc w:val="center"/>
+            </w:pPr>
+            <w:r>
+              <w:rPr>
+                <w:rFonts w:ascii="Times New Roman" w:hAnsi="Times New Roman" w:cs="Times New Roman" w:eastAsia="宋体"/>
                 <w:b w:val="0"/>
-                <w:sz w:val="17"/>
+                <w:sz w:val="15"/>
               </w:rPr>
               <w:t>目标 1.5，2.5，3.5</w:t>
             </w:r>
@@ -9654,15 +9336,14 @@
           </w:tcPr>
           <w:p>
             <w:pPr>
-              <w:spacing w:line="269" w:lineRule="auto" w:before="0" w:after="0"/>
-              <w:jc w:val="left"/>
-            </w:pPr>
-            <w:r/>
-            <w:r>
-              <w:rPr>
-                <w:rFonts w:ascii="Times New Roman" w:hAnsi="Times New Roman" w:eastAsia="宋体"/>
-                <w:b w:val="0"/>
-                <w:sz w:val="17"/>
+              <w:spacing w:line="240" w:lineRule="auto" w:before="0" w:after="0"/>
+              <w:jc w:val="center"/>
+            </w:pPr>
+            <w:r>
+              <w:rPr>
+                <w:rFonts w:ascii="Times New Roman" w:hAnsi="Times New Roman" w:cs="Times New Roman" w:eastAsia="宋体"/>
+                <w:b/>
+                <w:sz w:val="15"/>
               </w:rPr>
               <w:t>诊断、节能比较与交付</w:t>
             </w:r>
@@ -9681,17 +9362,16 @@
           </w:tcPr>
           <w:p>
             <w:pPr>
-              <w:spacing w:line="269" w:lineRule="auto" w:before="0" w:after="0"/>
+              <w:spacing w:line="240" w:lineRule="auto" w:before="0" w:after="0"/>
               <w:jc w:val="center"/>
             </w:pPr>
-            <w:r/>
-            <w:r>
-              <w:rPr>
-                <w:rFonts w:ascii="Times New Roman" w:hAnsi="Times New Roman" w:eastAsia="宋体"/>
+            <w:r>
+              <w:rPr>
+                <w:rFonts w:ascii="Times New Roman" w:hAnsi="Times New Roman" w:cs="Times New Roman" w:eastAsia="宋体"/>
                 <w:b w:val="0"/>
-                <w:sz w:val="17"/>
-              </w:rPr>
-              <w:t>20%</w:t>
+                <w:sz w:val="15"/>
+              </w:rPr>
+              <w:t>16%</w:t>
             </w:r>
           </w:p>
         </w:tc>
@@ -9708,15 +9388,14 @@
           </w:tcPr>
           <w:p>
             <w:pPr>
-              <w:spacing w:line="269" w:lineRule="auto" w:before="0" w:after="0"/>
+              <w:spacing w:line="240" w:lineRule="auto" w:before="0" w:after="0"/>
               <w:jc w:val="left"/>
             </w:pPr>
-            <w:r/>
-            <w:r>
-              <w:rPr>
-                <w:rFonts w:ascii="Times New Roman" w:hAnsi="Times New Roman" w:eastAsia="宋体"/>
+            <w:r>
+              <w:rPr>
+                <w:rFonts w:ascii="Times New Roman" w:hAnsi="Times New Roman" w:cs="Times New Roman" w:eastAsia="宋体"/>
                 <w:b w:val="0"/>
-                <w:sz w:val="17"/>
+                <w:sz w:val="15"/>
               </w:rPr>
               <w:t>故障复现、定位、修复和复测成环；有空转/动作次数比较；工程、版本及资料来源可追溯。</w:t>
             </w:r>
@@ -9735,15 +9414,14 @@
           </w:tcPr>
           <w:p>
             <w:pPr>
-              <w:spacing w:line="269" w:lineRule="auto" w:before="0" w:after="0"/>
-              <w:jc w:val="left"/>
-            </w:pPr>
-            <w:r/>
-            <w:r>
-              <w:rPr>
-                <w:rFonts w:ascii="Times New Roman" w:hAnsi="Times New Roman" w:eastAsia="宋体"/>
+              <w:spacing w:line="240" w:lineRule="auto" w:before="0" w:after="0"/>
+              <w:jc w:val="center"/>
+            </w:pPr>
+            <w:r>
+              <w:rPr>
+                <w:rFonts w:ascii="Times New Roman" w:hAnsi="Times New Roman" w:cs="Times New Roman" w:eastAsia="宋体"/>
                 <w:b w:val="0"/>
-                <w:sz w:val="17"/>
+                <w:sz w:val="15"/>
               </w:rPr>
               <w:t>目标 1.6，2.6，3.6</w:t>
             </w:r>
@@ -9764,17 +9442,16 @@
           </w:tcPr>
           <w:p>
             <w:pPr>
-              <w:spacing w:line="269" w:lineRule="auto" w:before="0" w:after="0"/>
-              <w:jc w:val="left"/>
-            </w:pPr>
-            <w:r/>
-            <w:r>
-              <w:rPr>
-                <w:rFonts w:ascii="Times New Roman" w:hAnsi="Times New Roman" w:eastAsia="宋体"/>
-                <w:b w:val="0"/>
-                <w:sz w:val="17"/>
-              </w:rPr>
-              <w:t>合计</w:t>
+              <w:spacing w:line="240" w:lineRule="auto" w:before="0" w:after="0"/>
+              <w:jc w:val="center"/>
+            </w:pPr>
+            <w:r>
+              <w:rPr>
+                <w:rFonts w:ascii="Times New Roman" w:hAnsi="Times New Roman" w:cs="Times New Roman" w:eastAsia="宋体"/>
+                <w:b/>
+                <w:sz w:val="15"/>
+              </w:rPr>
+              <w:t>原理与工程说明</w:t>
             </w:r>
           </w:p>
         </w:tc>
@@ -9791,17 +9468,16 @@
           </w:tcPr>
           <w:p>
             <w:pPr>
-              <w:spacing w:line="269" w:lineRule="auto" w:before="0" w:after="0"/>
+              <w:spacing w:line="240" w:lineRule="auto" w:before="0" w:after="0"/>
               <w:jc w:val="center"/>
             </w:pPr>
-            <w:r/>
-            <w:r>
-              <w:rPr>
-                <w:rFonts w:ascii="Times New Roman" w:hAnsi="Times New Roman" w:eastAsia="宋体"/>
+            <w:r>
+              <w:rPr>
+                <w:rFonts w:ascii="Times New Roman" w:hAnsi="Times New Roman" w:cs="Times New Roman" w:eastAsia="宋体"/>
                 <w:b w:val="0"/>
-                <w:sz w:val="17"/>
-              </w:rPr>
-              <w:t>100%</w:t>
+                <w:sz w:val="15"/>
+              </w:rPr>
+              <w:t>6%</w:t>
             </w:r>
           </w:p>
         </w:tc>
@@ -9818,10 +9494,17 @@
           </w:tcPr>
           <w:p>
             <w:pPr>
-              <w:spacing w:line="269" w:lineRule="auto" w:before="0" w:after="0"/>
+              <w:spacing w:line="240" w:lineRule="auto" w:before="0" w:after="0"/>
               <w:jc w:val="left"/>
             </w:pPr>
-            <w:r/>
+            <w:r>
+              <w:rPr>
+                <w:rFonts w:ascii="Times New Roman" w:hAnsi="Times New Roman" w:cs="Times New Roman" w:eastAsia="宋体"/>
+                <w:b w:val="0"/>
+                <w:sz w:val="15"/>
+              </w:rPr>
+              <w:t>独立解释扫描、LAD逻辑、状态转换、量程及HMI接口，并指出安全与工具边界。</w:t>
+            </w:r>
           </w:p>
         </w:tc>
         <w:tc>
@@ -9837,159 +9520,16 @@
           </w:tcPr>
           <w:p>
             <w:pPr>
-              <w:spacing w:line="269" w:lineRule="auto" w:before="0" w:after="0"/>
-              <w:jc w:val="left"/>
-            </w:pPr>
-            <w:r/>
-          </w:p>
-        </w:tc>
-      </w:tr>
-    </w:tbl>
-    <w:p>
-      <w:pPr>
-        <w:keepNext/>
-        <w:spacing w:line="283" w:lineRule="auto" w:before="60" w:after="20"/>
-      </w:pPr>
-      <w:r>
-        <w:rPr>
-          <w:rFonts w:ascii="Times New Roman" w:hAnsi="Times New Roman" w:eastAsia="宋体"/>
-          <w:b/>
-          <w:sz w:val="21"/>
-        </w:rPr>
-        <w:t>（4）个人核验与答辩评分标准</w:t>
-      </w:r>
-    </w:p>
-    <w:tbl>
-      <w:tblPr>
-        <w:tblW w:type="dxa" w:w="9054"/>
-        <w:jc w:val="center"/>
-        <w:tblLayout w:type="fixed"/>
-        <w:tblLook w:firstColumn="1" w:firstRow="1" w:lastColumn="0" w:lastRow="0" w:noHBand="0" w:noVBand="1" w:val="04A0"/>
-        <w:tblBorders>
-          <w:top w:val="single" w:sz="4" w:space="0" w:color="000000"/>
-          <w:left w:val="single" w:sz="4" w:space="0" w:color="000000"/>
-          <w:bottom w:val="single" w:sz="4" w:space="0" w:color="000000"/>
-          <w:right w:val="single" w:sz="4" w:space="0" w:color="000000"/>
-          <w:insideH w:val="single" w:sz="4" w:space="0" w:color="000000"/>
-          <w:insideV w:val="single" w:sz="4" w:space="0" w:color="000000"/>
-        </w:tblBorders>
-      </w:tblPr>
-      <w:tblGrid>
-        <w:gridCol w:w="1700"/>
-        <w:gridCol w:w="900"/>
-        <w:gridCol w:w="5100"/>
-        <w:gridCol w:w="1354"/>
-      </w:tblGrid>
-      <w:tr>
-        <w:trPr>
-          <w:tblHeader w:val="true"/>
-          <w:cantSplit/>
-        </w:trPr>
-        <w:tc>
-          <w:tcPr>
-            <w:tcW w:type="dxa" w:w="1700"/>
-            <w:tcMar>
-              <w:top w:w="80" w:type="dxa"/>
-              <w:start w:w="70" w:type="dxa"/>
-              <w:bottom w:w="80" w:type="dxa"/>
-              <w:end w:w="70" w:type="dxa"/>
-            </w:tcMar>
-            <w:vAlign w:val="center"/>
-          </w:tcPr>
-          <w:p>
-            <w:pPr>
-              <w:spacing w:line="269" w:lineRule="auto" w:before="0" w:after="0"/>
+              <w:spacing w:line="240" w:lineRule="auto" w:before="0" w:after="0"/>
               <w:jc w:val="center"/>
             </w:pPr>
-            <w:r/>
-            <w:r>
-              <w:rPr>
-                <w:rFonts w:ascii="Times New Roman" w:hAnsi="Times New Roman" w:eastAsia="宋体"/>
-                <w:b/>
-                <w:sz w:val="17"/>
-              </w:rPr>
-              <w:t>考核内容</w:t>
-            </w:r>
-          </w:p>
-        </w:tc>
-        <w:tc>
-          <w:tcPr>
-            <w:tcW w:type="dxa" w:w="900"/>
-            <w:tcMar>
-              <w:top w:w="80" w:type="dxa"/>
-              <w:start w:w="70" w:type="dxa"/>
-              <w:bottom w:w="80" w:type="dxa"/>
-              <w:end w:w="70" w:type="dxa"/>
-            </w:tcMar>
-            <w:vAlign w:val="center"/>
-          </w:tcPr>
-          <w:p>
-            <w:pPr>
-              <w:spacing w:line="269" w:lineRule="auto" w:before="0" w:after="0"/>
-              <w:jc w:val="center"/>
-            </w:pPr>
-            <w:r/>
-            <w:r>
-              <w:rPr>
-                <w:rFonts w:ascii="Times New Roman" w:hAnsi="Times New Roman" w:eastAsia="宋体"/>
-                <w:b/>
-                <w:sz w:val="17"/>
-              </w:rPr>
-              <w:t>成绩占比</w:t>
-            </w:r>
-          </w:p>
-        </w:tc>
-        <w:tc>
-          <w:tcPr>
-            <w:tcW w:type="dxa" w:w="5100"/>
-            <w:tcMar>
-              <w:top w:w="80" w:type="dxa"/>
-              <w:start w:w="70" w:type="dxa"/>
-              <w:bottom w:w="80" w:type="dxa"/>
-              <w:end w:w="70" w:type="dxa"/>
-            </w:tcMar>
-            <w:vAlign w:val="center"/>
-          </w:tcPr>
-          <w:p>
-            <w:pPr>
-              <w:spacing w:line="269" w:lineRule="auto" w:before="0" w:after="0"/>
-              <w:jc w:val="center"/>
-            </w:pPr>
-            <w:r/>
-            <w:r>
-              <w:rPr>
-                <w:rFonts w:ascii="Times New Roman" w:hAnsi="Times New Roman" w:eastAsia="宋体"/>
-                <w:b/>
-                <w:sz w:val="17"/>
-              </w:rPr>
-              <w:t>评分要求</w:t>
-            </w:r>
-          </w:p>
-        </w:tc>
-        <w:tc>
-          <w:tcPr>
-            <w:tcW w:type="dxa" w:w="1354"/>
-            <w:tcMar>
-              <w:top w:w="80" w:type="dxa"/>
-              <w:start w:w="70" w:type="dxa"/>
-              <w:bottom w:w="80" w:type="dxa"/>
-              <w:end w:w="70" w:type="dxa"/>
-            </w:tcMar>
-            <w:vAlign w:val="center"/>
-          </w:tcPr>
-          <w:p>
-            <w:pPr>
-              <w:spacing w:line="269" w:lineRule="auto" w:before="0" w:after="0"/>
-              <w:jc w:val="center"/>
-            </w:pPr>
-            <w:r/>
-            <w:r>
-              <w:rPr>
-                <w:rFonts w:ascii="Times New Roman" w:hAnsi="Times New Roman" w:eastAsia="宋体"/>
-                <w:b/>
-                <w:sz w:val="17"/>
-              </w:rPr>
-              <w:t>课程目标</w:t>
+            <w:r>
+              <w:rPr>
+                <w:rFonts w:ascii="Times New Roman" w:hAnsi="Times New Roman" w:cs="Times New Roman" w:eastAsia="宋体"/>
+                <w:b w:val="0"/>
+                <w:sz w:val="15"/>
+              </w:rPr>
+              <w:t>全部课程目标</w:t>
             </w:r>
           </w:p>
         </w:tc>
@@ -9999,26 +9539,19 @@
           <w:tcPr>
             <w:tcW w:type="dxa" w:w="1700"/>
             <w:vAlign w:val="center"/>
-            <w:tcMar>
-              <w:top w:w="80" w:type="dxa"/>
-              <w:start w:w="70" w:type="dxa"/>
-              <w:bottom w:w="80" w:type="dxa"/>
-              <w:end w:w="70" w:type="dxa"/>
-            </w:tcMar>
           </w:tcPr>
           <w:p>
             <w:pPr>
-              <w:spacing w:line="269" w:lineRule="auto" w:before="0" w:after="0"/>
-              <w:jc w:val="left"/>
-            </w:pPr>
-            <w:r/>
-            <w:r>
-              <w:rPr>
-                <w:rFonts w:ascii="Times New Roman" w:hAnsi="Times New Roman" w:eastAsia="宋体"/>
-                <w:b w:val="0"/>
-                <w:sz w:val="17"/>
-              </w:rPr>
-              <w:t>原理与工程说明</w:t>
+              <w:spacing w:line="240" w:lineRule="auto" w:before="0" w:after="0"/>
+              <w:jc w:val="center"/>
+            </w:pPr>
+            <w:r>
+              <w:rPr>
+                <w:rFonts w:ascii="Times New Roman" w:hAnsi="Times New Roman" w:cs="Times New Roman" w:eastAsia="宋体"/>
+                <w:b/>
+                <w:sz w:val="15"/>
+              </w:rPr>
+              <w:t>现场修改与排错</w:t>
             </w:r>
           </w:p>
         </w:tc>
@@ -10026,26 +9559,19 @@
           <w:tcPr>
             <w:tcW w:type="dxa" w:w="900"/>
             <w:vAlign w:val="center"/>
-            <w:tcMar>
-              <w:top w:w="80" w:type="dxa"/>
-              <w:start w:w="70" w:type="dxa"/>
-              <w:bottom w:w="80" w:type="dxa"/>
-              <w:end w:w="70" w:type="dxa"/>
-            </w:tcMar>
           </w:tcPr>
           <w:p>
             <w:pPr>
-              <w:spacing w:line="269" w:lineRule="auto" w:before="0" w:after="0"/>
+              <w:spacing w:line="240" w:lineRule="auto" w:before="0" w:after="0"/>
               <w:jc w:val="center"/>
             </w:pPr>
-            <w:r/>
-            <w:r>
-              <w:rPr>
-                <w:rFonts w:ascii="Times New Roman" w:hAnsi="Times New Roman" w:eastAsia="宋体"/>
+            <w:r>
+              <w:rPr>
+                <w:rFonts w:ascii="Times New Roman" w:hAnsi="Times New Roman" w:cs="Times New Roman" w:eastAsia="宋体"/>
                 <w:b w:val="0"/>
-                <w:sz w:val="17"/>
-              </w:rPr>
-              <w:t>30%</w:t>
+                <w:sz w:val="15"/>
+              </w:rPr>
+              <w:t>10%</w:t>
             </w:r>
           </w:p>
         </w:tc>
@@ -10053,26 +9579,19 @@
           <w:tcPr>
             <w:tcW w:type="dxa" w:w="5100"/>
             <w:vAlign w:val="center"/>
-            <w:tcMar>
-              <w:top w:w="80" w:type="dxa"/>
-              <w:start w:w="70" w:type="dxa"/>
-              <w:bottom w:w="80" w:type="dxa"/>
-              <w:end w:w="70" w:type="dxa"/>
-            </w:tcMar>
           </w:tcPr>
           <w:p>
             <w:pPr>
-              <w:spacing w:line="269" w:lineRule="auto" w:before="0" w:after="0"/>
+              <w:spacing w:line="240" w:lineRule="auto" w:before="0" w:after="0"/>
               <w:jc w:val="left"/>
             </w:pPr>
-            <w:r/>
-            <w:r>
-              <w:rPr>
-                <w:rFonts w:ascii="Times New Roman" w:hAnsi="Times New Roman" w:eastAsia="宋体"/>
+            <w:r>
+              <w:rPr>
+                <w:rFonts w:ascii="Times New Roman" w:hAnsi="Times New Roman" w:cs="Times New Roman" w:eastAsia="宋体"/>
                 <w:b w:val="0"/>
-                <w:sz w:val="17"/>
-              </w:rPr>
-              <w:t>独立解释扫描、LAD逻辑、状态转换、量程及HMI接口，并指出安全与工具边界。</w:t>
+                <w:sz w:val="15"/>
+              </w:rPr>
+              <w:t>完成指定定时/阈值/状态参数修改或故障定位，解释原因并用复测结果验证。</w:t>
             </w:r>
           </w:p>
         </w:tc>
@@ -10080,24 +9599,17 @@
           <w:tcPr>
             <w:tcW w:type="dxa" w:w="1354"/>
             <w:vAlign w:val="center"/>
-            <w:tcMar>
-              <w:top w:w="80" w:type="dxa"/>
-              <w:start w:w="70" w:type="dxa"/>
-              <w:bottom w:w="80" w:type="dxa"/>
-              <w:end w:w="70" w:type="dxa"/>
-            </w:tcMar>
           </w:tcPr>
           <w:p>
             <w:pPr>
-              <w:spacing w:line="269" w:lineRule="auto" w:before="0" w:after="0"/>
-              <w:jc w:val="left"/>
-            </w:pPr>
-            <w:r/>
-            <w:r>
-              <w:rPr>
-                <w:rFonts w:ascii="Times New Roman" w:hAnsi="Times New Roman" w:eastAsia="宋体"/>
+              <w:spacing w:line="240" w:lineRule="auto" w:before="0" w:after="0"/>
+              <w:jc w:val="center"/>
+            </w:pPr>
+            <w:r>
+              <w:rPr>
+                <w:rFonts w:ascii="Times New Roman" w:hAnsi="Times New Roman" w:cs="Times New Roman" w:eastAsia="宋体"/>
                 <w:b w:val="0"/>
-                <w:sz w:val="17"/>
+                <w:sz w:val="15"/>
               </w:rPr>
               <w:t>全部课程目标</w:t>
             </w:r>
@@ -10109,26 +9621,19 @@
           <w:tcPr>
             <w:tcW w:type="dxa" w:w="1700"/>
             <w:vAlign w:val="center"/>
-            <w:tcMar>
-              <w:top w:w="80" w:type="dxa"/>
-              <w:start w:w="70" w:type="dxa"/>
-              <w:bottom w:w="80" w:type="dxa"/>
-              <w:end w:w="70" w:type="dxa"/>
-            </w:tcMar>
           </w:tcPr>
           <w:p>
             <w:pPr>
-              <w:spacing w:line="269" w:lineRule="auto" w:before="0" w:after="0"/>
-              <w:jc w:val="left"/>
-            </w:pPr>
-            <w:r/>
-            <w:r>
-              <w:rPr>
-                <w:rFonts w:ascii="Times New Roman" w:hAnsi="Times New Roman" w:eastAsia="宋体"/>
-                <w:b w:val="0"/>
-                <w:sz w:val="17"/>
-              </w:rPr>
-              <w:t>现场修改与排错</w:t>
+              <w:spacing w:line="240" w:lineRule="auto" w:before="0" w:after="0"/>
+              <w:jc w:val="center"/>
+            </w:pPr>
+            <w:r>
+              <w:rPr>
+                <w:rFonts w:ascii="Times New Roman" w:hAnsi="Times New Roman" w:cs="Times New Roman" w:eastAsia="宋体"/>
+                <w:b/>
+                <w:sz w:val="15"/>
+              </w:rPr>
+              <w:t>个人贡献与资料核验</w:t>
             </w:r>
           </w:p>
         </w:tc>
@@ -10136,26 +9641,19 @@
           <w:tcPr>
             <w:tcW w:type="dxa" w:w="900"/>
             <w:vAlign w:val="center"/>
-            <w:tcMar>
-              <w:top w:w="80" w:type="dxa"/>
-              <w:start w:w="70" w:type="dxa"/>
-              <w:bottom w:w="80" w:type="dxa"/>
-              <w:end w:w="70" w:type="dxa"/>
-            </w:tcMar>
           </w:tcPr>
           <w:p>
             <w:pPr>
-              <w:spacing w:line="269" w:lineRule="auto" w:before="0" w:after="0"/>
+              <w:spacing w:line="240" w:lineRule="auto" w:before="0" w:after="0"/>
               <w:jc w:val="center"/>
             </w:pPr>
-            <w:r/>
-            <w:r>
-              <w:rPr>
-                <w:rFonts w:ascii="Times New Roman" w:hAnsi="Times New Roman" w:eastAsia="宋体"/>
+            <w:r>
+              <w:rPr>
+                <w:rFonts w:ascii="Times New Roman" w:hAnsi="Times New Roman" w:cs="Times New Roman" w:eastAsia="宋体"/>
                 <w:b w:val="0"/>
-                <w:sz w:val="17"/>
-              </w:rPr>
-              <w:t>50%</w:t>
+                <w:sz w:val="15"/>
+              </w:rPr>
+              <w:t>4%</w:t>
             </w:r>
           </w:p>
         </w:tc>
@@ -10163,26 +9661,19 @@
           <w:tcPr>
             <w:tcW w:type="dxa" w:w="5100"/>
             <w:vAlign w:val="center"/>
-            <w:tcMar>
-              <w:top w:w="80" w:type="dxa"/>
-              <w:start w:w="70" w:type="dxa"/>
-              <w:bottom w:w="80" w:type="dxa"/>
-              <w:end w:w="70" w:type="dxa"/>
-            </w:tcMar>
           </w:tcPr>
           <w:p>
             <w:pPr>
-              <w:spacing w:line="269" w:lineRule="auto" w:before="0" w:after="0"/>
+              <w:spacing w:line="240" w:lineRule="auto" w:before="0" w:after="0"/>
               <w:jc w:val="left"/>
             </w:pPr>
-            <w:r/>
-            <w:r>
-              <w:rPr>
-                <w:rFonts w:ascii="Times New Roman" w:hAnsi="Times New Roman" w:eastAsia="宋体"/>
+            <w:r>
+              <w:rPr>
+                <w:rFonts w:ascii="Times New Roman" w:hAnsi="Times New Roman" w:cs="Times New Roman" w:eastAsia="宋体"/>
                 <w:b w:val="0"/>
-                <w:sz w:val="17"/>
-              </w:rPr>
-              <w:t>完成指定定时/阈值/状态参数修改或故障定位，解释原因并用复测结果验证。</w:t>
+                <w:sz w:val="15"/>
+              </w:rPr>
+              <w:t>用工程版本、测试记录和口头说明对应个人工作；能找到手册依据并说明适用条件。</w:t>
             </w:r>
           </w:p>
         </w:tc>
@@ -10190,24 +9681,17 @@
           <w:tcPr>
             <w:tcW w:type="dxa" w:w="1354"/>
             <w:vAlign w:val="center"/>
-            <w:tcMar>
-              <w:top w:w="80" w:type="dxa"/>
-              <w:start w:w="70" w:type="dxa"/>
-              <w:bottom w:w="80" w:type="dxa"/>
-              <w:end w:w="70" w:type="dxa"/>
-            </w:tcMar>
           </w:tcPr>
           <w:p>
             <w:pPr>
-              <w:spacing w:line="269" w:lineRule="auto" w:before="0" w:after="0"/>
-              <w:jc w:val="left"/>
-            </w:pPr>
-            <w:r/>
-            <w:r>
-              <w:rPr>
-                <w:rFonts w:ascii="Times New Roman" w:hAnsi="Times New Roman" w:eastAsia="宋体"/>
+              <w:spacing w:line="240" w:lineRule="auto" w:before="0" w:after="0"/>
+              <w:jc w:val="center"/>
+            </w:pPr>
+            <w:r>
+              <w:rPr>
+                <w:rFonts w:ascii="Times New Roman" w:hAnsi="Times New Roman" w:cs="Times New Roman" w:eastAsia="宋体"/>
                 <w:b w:val="0"/>
-                <w:sz w:val="17"/>
+                <w:sz w:val="15"/>
               </w:rPr>
               <w:t>全部课程目标</w:t>
             </w:r>
@@ -10219,26 +9703,19 @@
           <w:tcPr>
             <w:tcW w:type="dxa" w:w="1700"/>
             <w:vAlign w:val="center"/>
-            <w:tcMar>
-              <w:top w:w="80" w:type="dxa"/>
-              <w:start w:w="70" w:type="dxa"/>
-              <w:bottom w:w="80" w:type="dxa"/>
-              <w:end w:w="70" w:type="dxa"/>
-            </w:tcMar>
           </w:tcPr>
           <w:p>
             <w:pPr>
-              <w:spacing w:line="269" w:lineRule="auto" w:before="0" w:after="0"/>
-              <w:jc w:val="left"/>
-            </w:pPr>
-            <w:r/>
-            <w:r>
-              <w:rPr>
-                <w:rFonts w:ascii="Times New Roman" w:hAnsi="Times New Roman" w:eastAsia="宋体"/>
-                <w:b w:val="0"/>
-                <w:sz w:val="17"/>
-              </w:rPr>
-              <w:t>个人贡献与资料核验</w:t>
+              <w:spacing w:line="240" w:lineRule="auto" w:before="0" w:after="0"/>
+              <w:jc w:val="center"/>
+            </w:pPr>
+            <w:r>
+              <w:rPr>
+                <w:rFonts w:ascii="Times New Roman" w:hAnsi="Times New Roman" w:cs="Times New Roman" w:eastAsia="宋体"/>
+                <w:b/>
+                <w:sz w:val="15"/>
+              </w:rPr>
+              <w:t>合计</w:t>
             </w:r>
           </w:p>
         </w:tc>
@@ -10246,26 +9723,19 @@
           <w:tcPr>
             <w:tcW w:type="dxa" w:w="900"/>
             <w:vAlign w:val="center"/>
-            <w:tcMar>
-              <w:top w:w="80" w:type="dxa"/>
-              <w:start w:w="70" w:type="dxa"/>
-              <w:bottom w:w="80" w:type="dxa"/>
-              <w:end w:w="70" w:type="dxa"/>
-            </w:tcMar>
           </w:tcPr>
           <w:p>
             <w:pPr>
-              <w:spacing w:line="269" w:lineRule="auto" w:before="0" w:after="0"/>
+              <w:spacing w:line="240" w:lineRule="auto" w:before="0" w:after="0"/>
               <w:jc w:val="center"/>
             </w:pPr>
-            <w:r/>
-            <w:r>
-              <w:rPr>
-                <w:rFonts w:ascii="Times New Roman" w:hAnsi="Times New Roman" w:eastAsia="宋体"/>
-                <w:b w:val="0"/>
-                <w:sz w:val="17"/>
-              </w:rPr>
-              <w:t>20%</w:t>
+            <w:r>
+              <w:rPr>
+                <w:rFonts w:ascii="Times New Roman" w:hAnsi="Times New Roman" w:cs="Times New Roman" w:eastAsia="宋体"/>
+                <w:b/>
+                <w:sz w:val="15"/>
+              </w:rPr>
+              <w:t>100%</w:t>
             </w:r>
           </w:p>
         </w:tc>
@@ -10273,26 +9743,18 @@
           <w:tcPr>
             <w:tcW w:type="dxa" w:w="5100"/>
             <w:vAlign w:val="center"/>
-            <w:tcMar>
-              <w:top w:w="80" w:type="dxa"/>
-              <w:start w:w="70" w:type="dxa"/>
-              <w:bottom w:w="80" w:type="dxa"/>
-              <w:end w:w="70" w:type="dxa"/>
-            </w:tcMar>
           </w:tcPr>
           <w:p>
             <w:pPr>
-              <w:spacing w:line="269" w:lineRule="auto" w:before="0" w:after="0"/>
+              <w:spacing w:line="240" w:lineRule="auto" w:before="0" w:after="0"/>
               <w:jc w:val="left"/>
             </w:pPr>
-            <w:r/>
-            <w:r>
-              <w:rPr>
-                <w:rFonts w:ascii="Times New Roman" w:hAnsi="Times New Roman" w:eastAsia="宋体"/>
-                <w:b w:val="0"/>
-                <w:sz w:val="17"/>
-              </w:rPr>
-              <w:t>用工程版本、测试记录和口头说明对应个人工作；能找到手册依据并说明适用条件。</w:t>
+            <w:r>
+              <w:rPr>
+                <w:rFonts w:ascii="Times New Roman" w:hAnsi="Times New Roman" w:cs="Times New Roman" w:eastAsia="宋体"/>
+                <w:b/>
+                <w:sz w:val="15"/>
+              </w:rPr>
             </w:r>
           </w:p>
         </w:tc>
@@ -10300,121 +9762,19 @@
           <w:tcPr>
             <w:tcW w:type="dxa" w:w="1354"/>
             <w:vAlign w:val="center"/>
-            <w:tcMar>
-              <w:top w:w="80" w:type="dxa"/>
-              <w:start w:w="70" w:type="dxa"/>
-              <w:bottom w:w="80" w:type="dxa"/>
-              <w:end w:w="70" w:type="dxa"/>
-            </w:tcMar>
           </w:tcPr>
           <w:p>
             <w:pPr>
-              <w:spacing w:line="269" w:lineRule="auto" w:before="0" w:after="0"/>
-              <w:jc w:val="left"/>
-            </w:pPr>
-            <w:r/>
-            <w:r>
-              <w:rPr>
-                <w:rFonts w:ascii="Times New Roman" w:hAnsi="Times New Roman" w:eastAsia="宋体"/>
-                <w:b w:val="0"/>
-                <w:sz w:val="17"/>
-              </w:rPr>
-              <w:t>全部课程目标</w:t>
-            </w:r>
-          </w:p>
-        </w:tc>
-      </w:tr>
-      <w:tr>
-        <w:tc>
-          <w:tcPr>
-            <w:tcW w:type="dxa" w:w="1700"/>
-            <w:vAlign w:val="center"/>
-            <w:tcMar>
-              <w:top w:w="80" w:type="dxa"/>
-              <w:start w:w="70" w:type="dxa"/>
-              <w:bottom w:w="80" w:type="dxa"/>
-              <w:end w:w="70" w:type="dxa"/>
-            </w:tcMar>
-          </w:tcPr>
-          <w:p>
-            <w:pPr>
-              <w:spacing w:line="269" w:lineRule="auto" w:before="0" w:after="0"/>
-              <w:jc w:val="left"/>
-            </w:pPr>
-            <w:r/>
-            <w:r>
-              <w:rPr>
-                <w:rFonts w:ascii="Times New Roman" w:hAnsi="Times New Roman" w:eastAsia="宋体"/>
-                <w:b w:val="0"/>
-                <w:sz w:val="17"/>
-              </w:rPr>
-              <w:t>合计</w:t>
-            </w:r>
-          </w:p>
-        </w:tc>
-        <w:tc>
-          <w:tcPr>
-            <w:tcW w:type="dxa" w:w="900"/>
-            <w:vAlign w:val="center"/>
-            <w:tcMar>
-              <w:top w:w="80" w:type="dxa"/>
-              <w:start w:w="70" w:type="dxa"/>
-              <w:bottom w:w="80" w:type="dxa"/>
-              <w:end w:w="70" w:type="dxa"/>
-            </w:tcMar>
-          </w:tcPr>
-          <w:p>
-            <w:pPr>
-              <w:spacing w:line="269" w:lineRule="auto" w:before="0" w:after="0"/>
+              <w:spacing w:line="240" w:lineRule="auto" w:before="0" w:after="0"/>
               <w:jc w:val="center"/>
             </w:pPr>
-            <w:r/>
-            <w:r>
-              <w:rPr>
-                <w:rFonts w:ascii="Times New Roman" w:hAnsi="Times New Roman" w:eastAsia="宋体"/>
-                <w:b w:val="0"/>
-                <w:sz w:val="17"/>
-              </w:rPr>
-              <w:t>100%</w:t>
-            </w:r>
-          </w:p>
-        </w:tc>
-        <w:tc>
-          <w:tcPr>
-            <w:tcW w:type="dxa" w:w="5100"/>
-            <w:vAlign w:val="center"/>
-            <w:tcMar>
-              <w:top w:w="80" w:type="dxa"/>
-              <w:start w:w="70" w:type="dxa"/>
-              <w:bottom w:w="80" w:type="dxa"/>
-              <w:end w:w="70" w:type="dxa"/>
-            </w:tcMar>
-          </w:tcPr>
-          <w:p>
-            <w:pPr>
-              <w:spacing w:line="269" w:lineRule="auto" w:before="0" w:after="0"/>
-              <w:jc w:val="left"/>
-            </w:pPr>
-            <w:r/>
-          </w:p>
-        </w:tc>
-        <w:tc>
-          <w:tcPr>
-            <w:tcW w:type="dxa" w:w="1354"/>
-            <w:vAlign w:val="center"/>
-            <w:tcMar>
-              <w:top w:w="80" w:type="dxa"/>
-              <w:start w:w="70" w:type="dxa"/>
-              <w:bottom w:w="80" w:type="dxa"/>
-              <w:end w:w="70" w:type="dxa"/>
-            </w:tcMar>
-          </w:tcPr>
-          <w:p>
-            <w:pPr>
-              <w:spacing w:line="269" w:lineRule="auto" w:before="0" w:after="0"/>
-              <w:jc w:val="left"/>
-            </w:pPr>
-            <w:r/>
+            <w:r>
+              <w:rPr>
+                <w:rFonts w:ascii="Times New Roman" w:hAnsi="Times New Roman" w:cs="Times New Roman" w:eastAsia="宋体"/>
+                <w:b/>
+                <w:sz w:val="15"/>
+              </w:rPr>
+            </w:r>
           </w:p>
         </w:tc>
       </w:tr>

</xml_diff>